<commit_message>
Synapep v0.4: pivot to AI-personalised aesthetic medical devices (Korea->HK), AI moat + data-flywheel, two-lens valuation
</commit_message>
<xml_diff>
--- a/synexo/Synapep_Business_Plan_and_Valuation.docx
+++ b/synexo/Synapep_Business_Plan_and_Valuation.docx
@@ -48,7 +48,7 @@
           <w:i/>
           <w:sz w:val="24"/>
         </w:rPr>
-        <w:t>AI-designed peptide / protein actives + SynExo synthetic recombinant exosomes</w:t>
+        <w:t>AI-personalised regenerative aesthetic medicine — physician-configured peptide treatments</w:t>
       </w:r>
     </w:p>
     <w:p>
@@ -63,7 +63,7 @@
           <w:color w:val="555555"/>
           <w:sz w:val="22"/>
         </w:rPr>
-        <w:t>Powered by IT-EXO® (immune-tolerant stealth exosomes) and ai.peptide / CodeLife.AI</w:t>
+        <w:t>Powered by CodeLife.AI (proprietary model) · IT-EXO® · SynExo</w:t>
       </w:r>
     </w:p>
     <w:p>
@@ -92,7 +92,7 @@
           <w:color w:val="555555"/>
           <w:sz w:val="20"/>
         </w:rPr>
-        <w:t>Draft v0.3  ·  Prepared 5 June 2026</w:t>
+        <w:t>Draft v0.4  ·  Prepared 6 June 2026</w:t>
       </w:r>
     </w:p>
     <w:p>
@@ -133,7 +133,7 @@
           <w:i w:val="0"/>
           <w:sz w:val="21"/>
         </w:rPr>
-        <w:t>Synapep is a new company commercializing Synexo technology — the SynExo synthetic recombinant exosome platform plus AI-designed peptide/protein actives. It is built on two core technologies: IT-EXO® (the immune-tolerant, HLA-G "stealth" exosome that lets results compound without immune decline) and ai.peptide / CodeLife.AI (the AI platform that designs peptides, proteins, and exosome cargo and optimizes targeting).</w:t>
+        <w:t>Synapep delivers AI-personalised regenerative aesthetic treatments. Physicians use CodeLife.AI — our proprietary aesthetic-medicine model — to configure peptide-based microneedling and intramuscular (IM) treatment kits to each clinical purpose, delivered as registered medical devices and powered by IT-EXO® (immune-tolerant stealth exosomes) and SynExo (synthetic recombinant exosomes).</w:t>
       </w:r>
     </w:p>
     <w:p>
@@ -146,7 +146,62 @@
           <w:i w:val="0"/>
           <w:sz w:val="21"/>
         </w:rPr>
-        <w:t>After a 6–9 month preparation phase (lab setup, −80 °C cold-chain and process qualification, QA, first cosmetic registrations), Synapep will be ready for sales in February 2027. The initial portfolio is 5–6 vial / skin-booster products with a combined capacity of 50,000–100,000 vials per month at a USD 30–35 ex-factory price. The route to market is aesthetic / cosmeceutical first (fast skin-booster pathway), with medical (wound healing, regeneration) indications following on the FDA/KFDA timeline — sold OEM / white-label so the customer holds the registration.</w:t>
+        <w:t>The wedge is a razor-and-blades business — an applicator device placed in clinics plus recurring personalised treatment kits (~$30–35 ex-factory). The durable asset is the AI engine and the data it compounds: peptides engineered to outperform generalised, off-the-shelf products, validated by our own AI quality-and-analytics tools. The long-run vision is a data-science company in aesthetic medicine built on our own large model.</w:t>
+      </w:r>
+    </w:p>
+    <w:p>
+      <w:pPr>
+        <w:spacing w:after="40"/>
+      </w:pPr>
+      <w:r>
+        <w:rPr>
+          <w:b/>
+          <w:i w:val="0"/>
+          <w:sz w:val="21"/>
+        </w:rPr>
+        <w:t>Why now / why this works.</w:t>
+      </w:r>
+    </w:p>
+    <w:p>
+      <w:pPr>
+        <w:pStyle w:val="ListBullet"/>
+      </w:pPr>
+      <w:r>
+        <w:rPr>
+          <w:b/>
+        </w:rPr>
+        <w:t>Large, growing market:</w:t>
+      </w:r>
+      <w:r>
+        <w:t xml:space="preserve"> medical aesthetics ≈ $17–18.5B (2024), ~10–13% CAGR → ~$56B by 2033; injectables &gt;40% of revenue. Korea is a global aesthetic hub; Hong Kong a gateway.</w:t>
+      </w:r>
+    </w:p>
+    <w:p>
+      <w:pPr>
+        <w:pStyle w:val="ListBullet"/>
+      </w:pPr>
+      <w:r>
+        <w:rPr>
+          <w:b/>
+        </w:rPr>
+        <w:t>Regulatory speed:</w:t>
+      </w:r>
+      <w:r>
+        <w:t xml:space="preserve"> Korea MFDS "modified device" path (same intended use / mechanism / raw materials → ~3 months), then Hong Kong's light, voluntary MDACS listing. Personalised by purpose, not per individual, so variants stay inside a registered family.</w:t>
+      </w:r>
+    </w:p>
+    <w:p>
+      <w:pPr>
+        <w:pStyle w:val="ListBullet"/>
+      </w:pPr>
+      <w:r>
+        <w:rPr>
+          <w:b/>
+        </w:rPr>
+        <w:t>New category:</w:t>
+      </w:r>
+      <w:r>
+        <w:t xml:space="preserve"> AI-personalised regenerative devices sit beside (not replace) HA fillers and botox.</w:t>
       </w:r>
     </w:p>
     <w:p>
@@ -172,7 +227,7 @@
           <w:i w:val="0"/>
           <w:sz w:val="21"/>
         </w:rPr>
-        <w:t>Synapep is a joint venture — WBI 70% (contributes the Synexo IP: IT-EXO / SynExo / CodeLife.AI, plus R&amp;D) and Eyesel 30% (the manufacturing entity). Synapep therefore owns/co-owns the platform and controls its own production. It is valued standalone at the ex-factory line; downstream distributors (e.g. NeuNova USA) are separate, non-consolidated entities and are excluded from this valuation.</w:t>
+        <w:t>JV — WBI 70% (IP: CodeLife.AI / IT-EXO / SynExo + R&amp;D) and Eyesel 30% (manufacturing). Valued standalone at the ex-factory line; distributors are separate, non-consolidated.</w:t>
       </w:r>
     </w:p>
     <w:p>
@@ -185,62 +240,7 @@
           <w:i w:val="0"/>
           <w:sz w:val="21"/>
         </w:rPr>
-        <w:t>Headline economics.</w:t>
-      </w:r>
-    </w:p>
-    <w:p>
-      <w:pPr>
-        <w:pStyle w:val="ListBullet"/>
-      </w:pPr>
-      <w:r>
-        <w:rPr>
-          <w:b/>
-        </w:rPr>
-        <w:t>Margin:</w:t>
-      </w:r>
-      <w:r>
-        <w:t xml:space="preserve"> ~66% ex-factory gross margin (material cost confirmed &lt; $5/vial; modeled $4.50).</w:t>
-      </w:r>
-    </w:p>
-    <w:p>
-      <w:pPr>
-        <w:pStyle w:val="ListBullet"/>
-      </w:pPr>
-      <w:r>
-        <w:rPr>
-          <w:b/>
-        </w:rPr>
-        <w:t>Revenue:</w:t>
-      </w:r>
-      <w:r>
-        <w:t xml:space="preserve"> $4.8M (2027) → $19.5M (2028) → $29.3M (2029) → $39.0M (2030).</w:t>
-      </w:r>
-    </w:p>
-    <w:p>
-      <w:pPr>
-        <w:pStyle w:val="ListBullet"/>
-      </w:pPr>
-      <w:r>
-        <w:rPr>
-          <w:b/>
-        </w:rPr>
-        <w:t>Profitability:</w:t>
-      </w:r>
-      <w:r>
-        <w:t xml:space="preserve"> EBITDA-positive in the launch year; ~$11M EBITDA by 2029.</w:t>
-      </w:r>
-    </w:p>
-    <w:p>
-      <w:pPr>
-        <w:spacing w:after="40"/>
-      </w:pPr>
-      <w:r>
-        <w:rPr>
-          <w:b/>
-          <w:i w:val="0"/>
-          <w:sz w:val="21"/>
-        </w:rPr>
-        <w:t>The ask.</w:t>
+        <w:t>Economics &amp; ask.</w:t>
       </w:r>
     </w:p>
     <w:p>
@@ -253,7 +253,7 @@
           <w:i w:val="0"/>
           <w:sz w:val="21"/>
         </w:rPr>
-        <w:t>USD 1.0M to kick off, at a recommended $5–7M pre-money ($6M midpoint → $1M ≈ 14.3%). Use of funds: $500K Synapep Lab initial investment + $600K running capital through launch.</w:t>
+        <w:t>~65% blended gross margin; revenue $5.3M (2027) → $20.3M (2028) → $30.2M (2029) → $39.9M (2030); EBITDA-positive in the launch year. Raising $1.0M to kick off at $5–7M pre-money ($6M midpoint → $1M ≈ 14.3%). The AI/data-platform thesis underpins a premium, institutional-AI Series A in 2028.</w:t>
       </w:r>
     </w:p>
     <w:p>
@@ -261,7 +261,7 @@
         <w:pStyle w:val="Heading1"/>
       </w:pPr>
       <w:r>
-        <w:t>2. The Opportunity</w:t>
+        <w:t>2. Technology &amp; the AI Moat</w:t>
       </w:r>
     </w:p>
     <w:p>
@@ -274,71 +274,139 @@
           <w:i w:val="0"/>
           <w:sz w:val="21"/>
         </w:rPr>
-        <w:t>Conventional exosome therapeutics face three bottlenecks the Synexo stack is built to solve:</w:t>
+        <w:t>Three pillars — the AI pillar is the spine; devices and kits are the wedge and the data-capture layer.</w:t>
       </w:r>
     </w:p>
+    <w:tbl>
+      <w:tblPr>
+        <w:tblStyle w:val="LightGrid-Accent1"/>
+        <w:tblW w:type="auto" w:w="0"/>
+        <w:jc w:val="center"/>
+        <w:tblLook w:firstColumn="1" w:firstRow="1" w:lastColumn="0" w:lastRow="0" w:noHBand="0" w:noVBand="1" w:val="04A0"/>
+      </w:tblPr>
+      <w:tblGrid>
+        <w:gridCol w:w="4320"/>
+        <w:gridCol w:w="4320"/>
+      </w:tblGrid>
+      <w:tr>
+        <w:tc>
+          <w:tcPr>
+            <w:tcW w:type="dxa" w:w="2736"/>
+          </w:tcPr>
+          <w:p>
+            <w:r>
+              <w:rPr>
+                <w:b/>
+                <w:sz w:val="19"/>
+              </w:rPr>
+              <w:t>Pillar</w:t>
+            </w:r>
+          </w:p>
+        </w:tc>
+        <w:tc>
+          <w:tcPr>
+            <w:tcW w:type="dxa" w:w="6624"/>
+          </w:tcPr>
+          <w:p>
+            <w:r>
+              <w:rPr>
+                <w:b/>
+                <w:sz w:val="19"/>
+              </w:rPr>
+              <w:t>What it is / why it matters</w:t>
+            </w:r>
+          </w:p>
+        </w:tc>
+      </w:tr>
+      <w:tr>
+        <w:tc>
+          <w:tcPr>
+            <w:tcW w:type="dxa" w:w="2736"/>
+          </w:tcPr>
+          <w:p>
+            <w:r>
+              <w:rPr>
+                <w:sz w:val="19"/>
+              </w:rPr>
+              <w:t>1 — AI engine &amp; data flywheel</w:t>
+            </w:r>
+          </w:p>
+        </w:tc>
+        <w:tc>
+          <w:tcPr>
+            <w:tcW w:type="dxa" w:w="6624"/>
+          </w:tcPr>
+          <w:p>
+            <w:r>
+              <w:rPr>
+                <w:sz w:val="19"/>
+              </w:rPr>
+              <w:t>CodeLife.AI designs personalised peptides engineered to OUTPERFORM generalised products (differentiator is performance, not just personalisation). A proprietary AI quality-&amp;-analytics suite validates every batch/variant and improves the model from each treatment — a compounding data flywheel. Built as physician decision-support within a cleared envelope to manage SaMD exposure.</w:t>
+            </w:r>
+          </w:p>
+        </w:tc>
+      </w:tr>
+      <w:tr>
+        <w:tc>
+          <w:tcPr>
+            <w:tcW w:type="dxa" w:w="2736"/>
+          </w:tcPr>
+          <w:p>
+            <w:r>
+              <w:rPr>
+                <w:sz w:val="19"/>
+              </w:rPr>
+              <w:t>2 — Devices &amp; kits (revenue wedge)</w:t>
+            </w:r>
+          </w:p>
+        </w:tc>
+        <w:tc>
+          <w:tcPr>
+            <w:tcW w:type="dxa" w:w="6624"/>
+          </w:tcPr>
+          <w:p>
+            <w:r>
+              <w:rPr>
+                <w:sz w:val="19"/>
+              </w:rPr>
+              <w:t>An applicator device placed/sold to clinics (also the data-capture endpoint) plus recurring personalised treatment kits (~$30–35 ex-factory), CodeLife-configured within an approved device family.</w:t>
+            </w:r>
+          </w:p>
+        </w:tc>
+      </w:tr>
+      <w:tr>
+        <w:tc>
+          <w:tcPr>
+            <w:tcW w:type="dxa" w:w="2736"/>
+          </w:tcPr>
+          <w:p>
+            <w:r>
+              <w:rPr>
+                <w:sz w:val="19"/>
+              </w:rPr>
+              <w:t>3 — Data monetisation (future upside)</w:t>
+            </w:r>
+          </w:p>
+        </w:tc>
+        <w:tc>
+          <w:tcPr>
+            <w:tcW w:type="dxa" w:w="6624"/>
+          </w:tcPr>
+          <w:p>
+            <w:r>
+              <w:rPr>
+                <w:sz w:val="19"/>
+              </w:rPr>
+              <w:t>Licensing the model/insights, physician outcome analytics, and R&amp;D partnerships — the institutional-AI-investor story. Not in the base P&amp;L.</w:t>
+            </w:r>
+          </w:p>
+        </w:tc>
+      </w:tr>
+    </w:tbl>
     <w:p>
       <w:pPr>
-        <w:pStyle w:val="ListBullet"/>
+        <w:spacing w:after="40"/>
       </w:pPr>
-      <w:r>
-        <w:rPr>
-          <w:b/>
-        </w:rPr>
-        <w:t>Immune rejection / instability —</w:t>
-      </w:r>
-      <w:r>
-        <w:t xml:space="preserve"> human-derived exosomes are unstable, costly, and carry rejection risk. IT-EXO® answers this with surface HLA-G acting as an immune "stealth shield," so efficacy compounds over time instead of declining.</w:t>
-      </w:r>
-    </w:p>
-    <w:p>
-      <w:pPr>
-        <w:pStyle w:val="ListBullet"/>
-      </w:pPr>
-      <w:r>
-        <w:rPr>
-          <w:b/>
-        </w:rPr>
-        <w:t>Inconsistent supply —</w:t>
-      </w:r>
-      <w:r>
-        <w:t xml:space="preserve"> SynExo is a synthetic recombinant platform with standardized specs (~20B particles/mL, 30–150 nm, &gt;95% purity, &gt;60% encapsulation), designed for scalable, reproducible production.</w:t>
-      </w:r>
-    </w:p>
-    <w:p>
-      <w:pPr>
-        <w:pStyle w:val="ListBullet"/>
-      </w:pPr>
-      <w:r>
-        <w:rPr>
-          <w:b/>
-        </w:rPr>
-        <w:t>Slow, expensive design —</w:t>
-      </w:r>
-      <w:r>
-        <w:t xml:space="preserve"> ai.peptide / CodeLife.AI designs peptides/proteins and exosome cargo computationally and simulates loading/targeting, compressing the R&amp;D cycle.</w:t>
-      </w:r>
-    </w:p>
-    <w:p>
-      <w:pPr>
-        <w:spacing w:after="120"/>
-      </w:pPr>
-      <w:r>
-        <w:rPr>
-          <w:b w:val="0"/>
-          <w:i w:val="0"/>
-          <w:sz w:val="21"/>
-        </w:rPr>
-        <w:t>The combination — stealth (IT-EXO) × synthetic delivery (SynExo) × AI design (ai.peptide) — is the moat: a technology + data flywheel wrapped around a capital-light, vial-based manufacturing operation.</w:t>
-      </w:r>
-    </w:p>
-    <w:p>
-      <w:pPr>
-        <w:pStyle w:val="Heading2"/>
-      </w:pPr>
-      <w:r>
-        <w:t>Core technologies</w:t>
-      </w:r>
     </w:p>
     <w:tbl>
       <w:tblPr>
@@ -357,13 +425,12 @@
             <w:tcW w:type="dxa" w:w="2448"/>
           </w:tcPr>
           <w:p>
-            <w:r/>
             <w:r>
               <w:rPr>
                 <w:b/>
                 <w:sz w:val="19"/>
               </w:rPr>
-              <w:t>Platform</w:t>
+              <w:t>Core technology</w:t>
             </w:r>
           </w:p>
         </w:tc>
@@ -372,7 +439,6 @@
             <w:tcW w:type="dxa" w:w="6912"/>
           </w:tcPr>
           <w:p>
-            <w:r/>
             <w:r>
               <w:rPr>
                 <w:b/>
@@ -389,7 +455,62 @@
             <w:tcW w:type="dxa" w:w="2448"/>
           </w:tcPr>
           <w:p>
-            <w:r/>
+            <w:r>
+              <w:rPr>
+                <w:sz w:val="19"/>
+              </w:rPr>
+              <w:t>CodeLife.AI</w:t>
+            </w:r>
+          </w:p>
+        </w:tc>
+        <w:tc>
+          <w:tcPr>
+            <w:tcW w:type="dxa" w:w="6912"/>
+          </w:tcPr>
+          <w:p>
+            <w:r>
+              <w:rPr>
+                <w:sz w:val="19"/>
+              </w:rPr>
+              <w:t>Proprietary AI platform/model designing peptides &amp; proteins and optimising delivery within an approved envelope; basis of the data-science-company vision.</w:t>
+            </w:r>
+          </w:p>
+        </w:tc>
+      </w:tr>
+      <w:tr>
+        <w:tc>
+          <w:tcPr>
+            <w:tcW w:type="dxa" w:w="2448"/>
+          </w:tcPr>
+          <w:p>
+            <w:r>
+              <w:rPr>
+                <w:sz w:val="19"/>
+              </w:rPr>
+              <w:t>IT-EXO®</w:t>
+            </w:r>
+          </w:p>
+        </w:tc>
+        <w:tc>
+          <w:tcPr>
+            <w:tcW w:type="dxa" w:w="6912"/>
+          </w:tcPr>
+          <w:p>
+            <w:r>
+              <w:rPr>
+                <w:sz w:val="19"/>
+              </w:rPr>
+              <w:t>Immune-tolerant layer: surface HLA-G suppresses NK/T-cell attack, so efficacy compounds rather than declines.</w:t>
+            </w:r>
+          </w:p>
+        </w:tc>
+      </w:tr>
+      <w:tr>
+        <w:tc>
+          <w:tcPr>
+            <w:tcW w:type="dxa" w:w="2448"/>
+          </w:tcPr>
+          <w:p>
             <w:r>
               <w:rPr>
                 <w:sz w:val="19"/>
@@ -403,72 +524,11 @@
             <w:tcW w:type="dxa" w:w="6912"/>
           </w:tcPr>
           <w:p>
-            <w:r/>
             <w:r>
               <w:rPr>
                 <w:sz w:val="19"/>
               </w:rPr>
-              <w:t>Synthetic recombinant exosome (salmon-derived) carrying plasmid-DNA cargo (EGF/bFGF/VEGF) and mRNA; the host cell transiently expresses the healing proteins. 12-month stability at −80 °C (cold chain).</w:t>
-            </w:r>
-          </w:p>
-        </w:tc>
-      </w:tr>
-      <w:tr>
-        <w:tc>
-          <w:tcPr>
-            <w:tcW w:type="dxa" w:w="2448"/>
-          </w:tcPr>
-          <w:p>
-            <w:r/>
-            <w:r>
-              <w:rPr>
-                <w:sz w:val="19"/>
-              </w:rPr>
-              <w:t>IT-EXO®</w:t>
-            </w:r>
-          </w:p>
-        </w:tc>
-        <w:tc>
-          <w:tcPr>
-            <w:tcW w:type="dxa" w:w="6912"/>
-          </w:tcPr>
-          <w:p>
-            <w:r/>
-            <w:r>
-              <w:rPr>
-                <w:sz w:val="19"/>
-              </w:rPr>
-              <w:t>Immune-tolerant layer: surface HLA-G engages ILT2/ILT4/KIR2DL4 to suppress NK/T-cell attack (IL-1β ~1.8→0.8 ng/mL, TNF-α ~0.7→0.4 ng/mL; &gt;95% cell viability). Differentiator: no efficacy decline, effects compound.</w:t>
-            </w:r>
-          </w:p>
-        </w:tc>
-      </w:tr>
-      <w:tr>
-        <w:tc>
-          <w:tcPr>
-            <w:tcW w:type="dxa" w:w="2448"/>
-          </w:tcPr>
-          <w:p>
-            <w:r/>
-            <w:r>
-              <w:rPr>
-                <w:sz w:val="19"/>
-              </w:rPr>
-              <w:t>ai.peptide / CodeLife.AI</w:t>
-            </w:r>
-          </w:p>
-        </w:tc>
-        <w:tc>
-          <w:tcPr>
-            <w:tcW w:type="dxa" w:w="6912"/>
-          </w:tcPr>
-          <w:p>
-            <w:r/>
-            <w:r>
-              <w:rPr>
-                <w:sz w:val="19"/>
-              </w:rPr>
-              <w:t>AI platform designing peptides/proteins for functional cosmetics and optimizing exosome cargo, loading efficiency, and targeting.</w:t>
+              <w:t>Synthetic recombinant exosome (salmon-derived) carrying growth-factor/peptide cargo; ~20B particles/mL, 30–150 nm, &gt;95% purity; 12-month stability at −80 °C.</w:t>
             </w:r>
           </w:p>
         </w:tc>
@@ -484,20 +544,7 @@
         <w:pStyle w:val="Heading1"/>
       </w:pPr>
       <w:r>
-        <w:t>3. Product &amp; Intellectual Property</w:t>
-      </w:r>
-    </w:p>
-    <w:p>
-      <w:pPr>
-        <w:spacing w:after="40"/>
-      </w:pPr>
-      <w:r>
-        <w:rPr>
-          <w:b/>
-          <w:i w:val="0"/>
-          <w:sz w:val="21"/>
-        </w:rPr>
-        <w:t>Portfolio (5–6 SKUs — vials / skin boosters / ampoules).</w:t>
+        <w:t>3. Vision — From Devices to a Data-Science Company</w:t>
       </w:r>
     </w:p>
     <w:p>
@@ -510,20 +557,142 @@
           <w:i w:val="0"/>
           <w:sz w:val="21"/>
         </w:rPr>
-        <w:t>Likely lines, to confirm: ① aesthetic skin-booster (rejuvenation/collagen), ② scalp/hair regeneration, ③ wound-healing/repair, ④ post-procedure recovery, ⑤ targeted AI-peptide active, ⑥ custom-cargo SynExo. Together they fill the 50,000–100,000 vials/month line capacity.</w:t>
+        <w:t>Devices and kits are the wedge that puts CodeLife into clinics and starts the data flywheel. As personalised treatments and outcomes accumulate, Synapep builds a proprietary aesthetic-medicine dataset and its own large model — the durable, compounding asset. The endpoint is a data-science company in aesthetic medicine: AI-designed, outcome-validated, continuously improving — and fundable by institutional AI investors.</w:t>
       </w:r>
     </w:p>
     <w:p>
       <w:pPr>
-        <w:spacing w:after="40"/>
+        <w:pStyle w:val="Heading1"/>
+      </w:pPr>
+      <w:r>
+        <w:t>4. Regulatory Strategy (Korea → Hong Kong)</w:t>
+      </w:r>
+    </w:p>
+    <w:p>
+      <w:pPr>
+        <w:pStyle w:val="ListBullet"/>
       </w:pPr>
       <w:r>
         <w:rPr>
           <w:b/>
+        </w:rPr>
+        <w:t>Korea (MFDS) first —</w:t>
+      </w:r>
+      <w:r>
+        <w:t xml:space="preserve"> register the microneedling/topical applicator + kit as a device family; CodeLife variants register as "modified devices" (same intended use / mechanism / raw materials) on the fast path (Class I ≈ 15 business days; Class II "modified" via conformity bodies; ~3 months realistic).</w:t>
+      </w:r>
+    </w:p>
+    <w:p>
+      <w:pPr>
+        <w:pStyle w:val="ListBullet"/>
+      </w:pPr>
+      <w:r>
+        <w:rPr>
+          <w:b/>
+        </w:rPr>
+        <w:t>Hong Kong next —</w:t>
+      </w:r>
+      <w:r>
+        <w:t xml:space="preserve"> light, voluntary MDACS listing; move while the voluntary window is open (a statutory framework is coming).</w:t>
+      </w:r>
+    </w:p>
+    <w:p>
+      <w:pPr>
+        <w:pStyle w:val="ListBullet"/>
+      </w:pPr>
+      <w:r>
+        <w:rPr>
+          <w:b/>
+        </w:rPr>
+        <w:t>Keep the fast path valid —</w:t>
+      </w:r>
+      <w:r>
+        <w:t xml:space="preserve"> personalise via device parameters (delivery, depth, concentration within an approved range, a menu of pre-cleared options), NOT by changing the active molecule, which would break the "same raw materials" test.</w:t>
+      </w:r>
+    </w:p>
+    <w:p>
+      <w:pPr>
+        <w:pStyle w:val="ListBullet"/>
+      </w:pPr>
+      <w:r>
+        <w:rPr>
+          <w:b/>
+        </w:rPr>
+        <w:t>Two tracks —</w:t>
+      </w:r>
+      <w:r>
+        <w:t xml:space="preserve"> microneedling/topical line carries the device fast-path; the IM injectable line runs on a separate drug/cosmetic pathway (see Risks).</w:t>
+      </w:r>
+    </w:p>
+    <w:p>
+      <w:pPr>
+        <w:pStyle w:val="Heading1"/>
+      </w:pPr>
+      <w:r>
+        <w:t>5. Go-to-Market</w:t>
+      </w:r>
+    </w:p>
+    <w:p>
+      <w:pPr>
+        <w:pStyle w:val="ListBullet"/>
+      </w:pPr>
+      <w:r>
+        <w:rPr>
+          <w:b/>
+        </w:rPr>
+        <w:t>Customers —</w:t>
+      </w:r>
+      <w:r>
+        <w:t xml:space="preserve"> aesthetic/derm physicians &amp; clinics — Korea first, then Hong Kong.</w:t>
+      </w:r>
+    </w:p>
+    <w:p>
+      <w:pPr>
+        <w:pStyle w:val="ListBullet"/>
+      </w:pPr>
+      <w:r>
+        <w:rPr>
+          <w:b/>
+        </w:rPr>
+        <w:t>Model —</w:t>
+      </w:r>
+      <w:r>
+        <w:t xml:space="preserve"> place/sell the applicator device, then earn recurring revenue on personalised kits; CodeLife + outcome data make the relationship sticky.</w:t>
+      </w:r>
+    </w:p>
+    <w:p>
+      <w:pPr>
+        <w:pStyle w:val="ListBullet"/>
+      </w:pPr>
+      <w:r>
+        <w:rPr>
+          <w:b/>
+        </w:rPr>
+        <w:t>Build —</w:t>
+      </w:r>
+      <w:r>
+        <w:t xml:space="preserve"> a focused clinical/KOL salesforce in two concentrated markets; physician advocates and head-to-head efficacy data drive adoption.</w:t>
+      </w:r>
+    </w:p>
+    <w:p>
+      <w:pPr>
+        <w:pStyle w:val="Heading1"/>
+      </w:pPr>
+      <w:r>
+        <w:t>6. Financial Model</w:t>
+      </w:r>
+    </w:p>
+    <w:p>
+      <w:pPr>
+        <w:spacing w:after="120"/>
+      </w:pPr>
+      <w:r>
+        <w:rPr>
+          <w:b w:val="0"/>
           <w:i w:val="0"/>
           <w:sz w:val="21"/>
         </w:rPr>
-        <w:t>Intellectual property (held by WBI, contributed into the JV — confirm scope).</w:t>
+        <w:t>Bottom-up by clinics (~100–125 kits/clinic/month at maturity). Kit unit economics: COGS = 20%×EXW + $4.50 material = $11.00 at $32.50 → GP $21.50, 66.2%. Device ASP $3,000 at 40% GM. All figures USD; illustrative.</w:t>
       </w:r>
     </w:p>
     <w:tbl>
@@ -534,53 +703,95 @@
         <w:tblLook w:firstColumn="1" w:firstRow="1" w:lastColumn="0" w:lastRow="0" w:noHBand="0" w:noVBand="1" w:val="04A0"/>
       </w:tblPr>
       <w:tblGrid>
-        <w:gridCol w:w="2880"/>
-        <w:gridCol w:w="2880"/>
-        <w:gridCol w:w="2880"/>
+        <w:gridCol w:w="1440"/>
+        <w:gridCol w:w="1440"/>
+        <w:gridCol w:w="1440"/>
+        <w:gridCol w:w="1440"/>
+        <w:gridCol w:w="1440"/>
+        <w:gridCol w:w="1440"/>
       </w:tblGrid>
       <w:tr>
         <w:tc>
           <w:tcPr>
-            <w:tcW w:type="dxa" w:w="3312"/>
+            <w:tcW w:type="dxa" w:w="2880"/>
           </w:tcPr>
           <w:p>
-            <w:r/>
             <w:r>
               <w:rPr>
                 <w:b/>
                 <w:sz w:val="19"/>
               </w:rPr>
-              <w:t>Asset</w:t>
+              <w:t>Driver</w:t>
             </w:r>
           </w:p>
         </w:tc>
         <w:tc>
           <w:tcPr>
-            <w:tcW w:type="dxa" w:w="3744"/>
+            <w:tcW w:type="dxa" w:w="1296"/>
           </w:tcPr>
           <w:p>
-            <w:r/>
             <w:r>
               <w:rPr>
                 <w:b/>
                 <w:sz w:val="19"/>
               </w:rPr>
-              <w:t>Ref / number</w:t>
+              <w:t>2026 prep</w:t>
             </w:r>
           </w:p>
         </w:tc>
         <w:tc>
           <w:tcPr>
-            <w:tcW w:type="dxa" w:w="2304"/>
+            <w:tcW w:type="dxa" w:w="1152"/>
           </w:tcPr>
           <w:p>
-            <w:r/>
             <w:r>
               <w:rPr>
                 <w:b/>
                 <w:sz w:val="19"/>
               </w:rPr>
-              <w:t>Status</w:t>
+              <w:t>2027</w:t>
+            </w:r>
+          </w:p>
+        </w:tc>
+        <w:tc>
+          <w:tcPr>
+            <w:tcW w:type="dxa" w:w="1152"/>
+          </w:tcPr>
+          <w:p>
+            <w:r>
+              <w:rPr>
+                <w:b/>
+                <w:sz w:val="19"/>
+              </w:rPr>
+              <w:t>2028</w:t>
+            </w:r>
+          </w:p>
+        </w:tc>
+        <w:tc>
+          <w:tcPr>
+            <w:tcW w:type="dxa" w:w="1152"/>
+          </w:tcPr>
+          <w:p>
+            <w:r>
+              <w:rPr>
+                <w:b/>
+                <w:sz w:val="19"/>
+              </w:rPr>
+              <w:t>2029</w:t>
+            </w:r>
+          </w:p>
+        </w:tc>
+        <w:tc>
+          <w:tcPr>
+            <w:tcW w:type="dxa" w:w="1152"/>
+          </w:tcPr>
+          <w:p>
+            <w:r>
+              <w:rPr>
+                <w:b/>
+                <w:sz w:val="19"/>
+              </w:rPr>
+              <w:t>2030</w:t>
             </w:r>
           </w:p>
         </w:tc>
@@ -588,43 +799,79 @@
       <w:tr>
         <w:tc>
           <w:tcPr>
-            <w:tcW w:type="dxa" w:w="3312"/>
+            <w:tcW w:type="dxa" w:w="2880"/>
           </w:tcPr>
           <w:p>
-            <w:r/>
             <w:r>
               <w:rPr>
                 <w:sz w:val="19"/>
               </w:rPr>
-              <w:t>SynExo HLA-G (Korea)</w:t>
+              <w:t>Clinics (cumulative)</w:t>
             </w:r>
           </w:p>
         </w:tc>
         <w:tc>
           <w:tcPr>
-            <w:tcW w:type="dxa" w:w="3744"/>
+            <w:tcW w:type="dxa" w:w="1296"/>
           </w:tcPr>
           <w:p>
-            <w:r/>
             <w:r>
               <w:rPr>
                 <w:sz w:val="19"/>
               </w:rPr>
-              <w:t>P25E10C1475 (filed 2025-11-11)</w:t>
+              <w:t>0</w:t>
             </w:r>
           </w:p>
         </w:tc>
         <w:tc>
           <w:tcPr>
-            <w:tcW w:type="dxa" w:w="2304"/>
+            <w:tcW w:type="dxa" w:w="1152"/>
           </w:tcPr>
           <w:p>
-            <w:r/>
             <w:r>
               <w:rPr>
                 <w:sz w:val="19"/>
               </w:rPr>
-              <w:t>Application</w:t>
+              <w:t>150</w:t>
+            </w:r>
+          </w:p>
+        </w:tc>
+        <w:tc>
+          <w:tcPr>
+            <w:tcW w:type="dxa" w:w="1152"/>
+          </w:tcPr>
+          <w:p>
+            <w:r>
+              <w:rPr>
+                <w:sz w:val="19"/>
+              </w:rPr>
+              <w:t>400</w:t>
+            </w:r>
+          </w:p>
+        </w:tc>
+        <w:tc>
+          <w:tcPr>
+            <w:tcW w:type="dxa" w:w="1152"/>
+          </w:tcPr>
+          <w:p>
+            <w:r>
+              <w:rPr>
+                <w:sz w:val="19"/>
+              </w:rPr>
+              <w:t>700</w:t>
+            </w:r>
+          </w:p>
+        </w:tc>
+        <w:tc>
+          <w:tcPr>
+            <w:tcW w:type="dxa" w:w="1152"/>
+          </w:tcPr>
+          <w:p>
+            <w:r>
+              <w:rPr>
+                <w:sz w:val="19"/>
+              </w:rPr>
+              <w:t>1,000</w:t>
             </w:r>
           </w:p>
         </w:tc>
@@ -632,43 +879,79 @@
       <w:tr>
         <w:tc>
           <w:tcPr>
-            <w:tcW w:type="dxa" w:w="3312"/>
+            <w:tcW w:type="dxa" w:w="2880"/>
           </w:tcPr>
           <w:p>
-            <w:r/>
             <w:r>
               <w:rPr>
                 <w:sz w:val="19"/>
               </w:rPr>
-              <w:t>SynExo HLA-G (PCT)</w:t>
+              <w:t>New clinics (devices sold)</w:t>
             </w:r>
           </w:p>
         </w:tc>
         <w:tc>
           <w:tcPr>
-            <w:tcW w:type="dxa" w:w="3744"/>
+            <w:tcW w:type="dxa" w:w="1296"/>
           </w:tcPr>
           <w:p>
-            <w:r/>
             <w:r>
               <w:rPr>
                 <w:sz w:val="19"/>
               </w:rPr>
-              <w:t>X25E10C0258 (2025-11-18)</w:t>
+              <w:t>0</w:t>
             </w:r>
           </w:p>
         </w:tc>
         <w:tc>
           <w:tcPr>
-            <w:tcW w:type="dxa" w:w="2304"/>
+            <w:tcW w:type="dxa" w:w="1152"/>
           </w:tcPr>
           <w:p>
-            <w:r/>
             <w:r>
               <w:rPr>
                 <w:sz w:val="19"/>
               </w:rPr>
-              <w:t>PCT application</w:t>
+              <w:t>150</w:t>
+            </w:r>
+          </w:p>
+        </w:tc>
+        <w:tc>
+          <w:tcPr>
+            <w:tcW w:type="dxa" w:w="1152"/>
+          </w:tcPr>
+          <w:p>
+            <w:r>
+              <w:rPr>
+                <w:sz w:val="19"/>
+              </w:rPr>
+              <w:t>250</w:t>
+            </w:r>
+          </w:p>
+        </w:tc>
+        <w:tc>
+          <w:tcPr>
+            <w:tcW w:type="dxa" w:w="1152"/>
+          </w:tcPr>
+          <w:p>
+            <w:r>
+              <w:rPr>
+                <w:sz w:val="19"/>
+              </w:rPr>
+              <w:t>300</w:t>
+            </w:r>
+          </w:p>
+        </w:tc>
+        <w:tc>
+          <w:tcPr>
+            <w:tcW w:type="dxa" w:w="1152"/>
+          </w:tcPr>
+          <w:p>
+            <w:r>
+              <w:rPr>
+                <w:sz w:val="19"/>
+              </w:rPr>
+              <w:t>300</w:t>
             </w:r>
           </w:p>
         </w:tc>
@@ -676,175 +959,79 @@
       <w:tr>
         <w:tc>
           <w:tcPr>
-            <w:tcW w:type="dxa" w:w="3312"/>
+            <w:tcW w:type="dxa" w:w="2880"/>
           </w:tcPr>
           <w:p>
-            <w:r/>
             <w:r>
               <w:rPr>
                 <w:sz w:val="19"/>
               </w:rPr>
-              <w:t>Safe-Browning shampoo</w:t>
+              <w:t>Treatment kits (000s)</w:t>
             </w:r>
           </w:p>
         </w:tc>
         <w:tc>
           <w:tcPr>
-            <w:tcW w:type="dxa" w:w="3744"/>
+            <w:tcW w:type="dxa" w:w="1296"/>
           </w:tcPr>
           <w:p>
-            <w:r/>
             <w:r>
               <w:rPr>
                 <w:sz w:val="19"/>
               </w:rPr>
-              <w:t>KR 10-2025-0191060</w:t>
+              <w:t>0</w:t>
             </w:r>
           </w:p>
         </w:tc>
         <w:tc>
           <w:tcPr>
-            <w:tcW w:type="dxa" w:w="2304"/>
+            <w:tcW w:type="dxa" w:w="1152"/>
           </w:tcPr>
           <w:p>
-            <w:r/>
             <w:r>
               <w:rPr>
                 <w:sz w:val="19"/>
               </w:rPr>
-              <w:t>Application</w:t>
-            </w:r>
-          </w:p>
-        </w:tc>
-      </w:tr>
-      <w:tr>
-        <w:tc>
-          <w:tcPr>
-            <w:tcW w:type="dxa" w:w="3312"/>
-          </w:tcPr>
-          <w:p>
-            <w:r/>
-            <w:r>
-              <w:rPr>
-                <w:sz w:val="19"/>
-              </w:rPr>
-              <w:t>Ion-microneedling device</w:t>
+              <w:t>148</w:t>
             </w:r>
           </w:p>
         </w:tc>
         <w:tc>
           <w:tcPr>
-            <w:tcW w:type="dxa" w:w="3744"/>
+            <w:tcW w:type="dxa" w:w="1152"/>
           </w:tcPr>
           <w:p>
-            <w:r/>
             <w:r>
               <w:rPr>
                 <w:sz w:val="19"/>
               </w:rPr>
-              <w:t>KR 10-2654857</w:t>
+              <w:t>600</w:t>
             </w:r>
           </w:p>
         </w:tc>
         <w:tc>
           <w:tcPr>
-            <w:tcW w:type="dxa" w:w="2304"/>
+            <w:tcW w:type="dxa" w:w="1152"/>
           </w:tcPr>
           <w:p>
-            <w:r/>
             <w:r>
               <w:rPr>
                 <w:sz w:val="19"/>
               </w:rPr>
-              <w:t>Registered</w:t>
-            </w:r>
-          </w:p>
-        </w:tc>
-      </w:tr>
-      <w:tr>
-        <w:tc>
-          <w:tcPr>
-            <w:tcW w:type="dxa" w:w="3312"/>
-          </w:tcPr>
-          <w:p>
-            <w:r/>
-            <w:r>
-              <w:rPr>
-                <w:sz w:val="19"/>
-              </w:rPr>
-              <w:t>Sophora Japonica stem cell</w:t>
+              <w:t>900</w:t>
             </w:r>
           </w:p>
         </w:tc>
         <w:tc>
           <w:tcPr>
-            <w:tcW w:type="dxa" w:w="3744"/>
+            <w:tcW w:type="dxa" w:w="1152"/>
           </w:tcPr>
           <w:p>
-            <w:r/>
             <w:r>
               <w:rPr>
                 <w:sz w:val="19"/>
               </w:rPr>
-              <w:t>KR 10-1080297</w:t>
-            </w:r>
-          </w:p>
-        </w:tc>
-        <w:tc>
-          <w:tcPr>
-            <w:tcW w:type="dxa" w:w="2304"/>
-          </w:tcPr>
-          <w:p>
-            <w:r/>
-            <w:r>
-              <w:rPr>
-                <w:sz w:val="19"/>
-              </w:rPr>
-              <w:t>Registered</w:t>
-            </w:r>
-          </w:p>
-        </w:tc>
-      </w:tr>
-      <w:tr>
-        <w:tc>
-          <w:tcPr>
-            <w:tcW w:type="dxa" w:w="3312"/>
-          </w:tcPr>
-          <w:p>
-            <w:r/>
-            <w:r>
-              <w:rPr>
-                <w:sz w:val="19"/>
-              </w:rPr>
-              <w:t>SynExo HLA-G</w:t>
-            </w:r>
-          </w:p>
-        </w:tc>
-        <w:tc>
-          <w:tcPr>
-            <w:tcW w:type="dxa" w:w="3744"/>
-          </w:tcPr>
-          <w:p>
-            <w:r/>
-            <w:r>
-              <w:rPr>
-                <w:sz w:val="19"/>
-              </w:rPr>
-              <w:t>Journal-ready manuscript</w:t>
-            </w:r>
-          </w:p>
-        </w:tc>
-        <w:tc>
-          <w:tcPr>
-            <w:tcW w:type="dxa" w:w="2304"/>
-          </w:tcPr>
-          <w:p>
-            <w:r/>
-            <w:r>
-              <w:rPr>
-                <w:sz w:val="19"/>
-              </w:rPr>
-              <w:t>Publication pending</w:t>
+              <w:t>1,200</w:t>
             </w:r>
           </w:p>
         </w:tc>
@@ -857,73 +1044,10 @@
     </w:p>
     <w:p>
       <w:pPr>
-        <w:spacing w:after="120"/>
+        <w:pStyle w:val="Heading2"/>
       </w:pPr>
       <w:r>
-        <w:rPr>
-          <w:b w:val="0"/>
-          <w:i/>
-          <w:sz w:val="21"/>
-        </w:rPr>
-        <w:t>Credibility to leverage: endorsement by Prof. Cho Hangrae (President, Korean Dermatological Society); NET (New Excellent Technology) government award; MORIMANA clinical claim of +19% hair thickness and −66% scalp flakiness in 8 weeks; use by leading Korean clinics.</w:t>
-      </w:r>
-    </w:p>
-    <w:p>
-      <w:pPr>
-        <w:pStyle w:val="Heading1"/>
-      </w:pPr>
-      <w:r>
-        <w:t>4. Go-to-Market</w:t>
-      </w:r>
-    </w:p>
-    <w:p>
-      <w:pPr>
-        <w:pStyle w:val="ListBullet"/>
-      </w:pPr>
-      <w:r>
-        <w:rPr>
-          <w:b/>
-        </w:rPr>
-        <w:t>Channel — OEM / white-label.</w:t>
-      </w:r>
-      <w:r>
-        <w:t xml:space="preserve"> Synapep sells bulk/vialled product ex-factory (EXW) to independent distributors, partner brands, aesthetic clinics, and med-spas who relabel and hold the registration. These are arm's-length customers buying at the $30–35 EXW price; their downstream margin is not Synapep's and is excluded from the valuation. (NeuNova USA, a separate non-consolidated entity, is one potential US distributor.)</w:t>
-      </w:r>
-    </w:p>
-    <w:p>
-      <w:pPr>
-        <w:pStyle w:val="ListBullet"/>
-      </w:pPr>
-      <w:r>
-        <w:rPr>
-          <w:b/>
-        </w:rPr>
-        <w:t>Ramp —</w:t>
-      </w:r>
-      <w:r>
-        <w:t xml:space="preserve"> the constraint in 2027 is customer acquisition/qualification, not capacity. The model ramps from 2K vials in Feb 2027 to a 28K/month exit run-rate by Dec 2027, then 50K (2028) → 75K (2029) → 100K (2030).</w:t>
-      </w:r>
-    </w:p>
-    <w:p>
-      <w:pPr>
-        <w:pStyle w:val="ListBullet"/>
-      </w:pPr>
-      <w:r>
-        <w:rPr>
-          <w:b/>
-        </w:rPr>
-        <w:t>Pricing —</w:t>
-      </w:r>
-      <w:r>
-        <w:t xml:space="preserve"> $30–35/vial EXW; large OEM contracts may price nearer the $30 floor, still at ~65% gross margin.</w:t>
-      </w:r>
-    </w:p>
-    <w:p>
-      <w:pPr>
-        <w:pStyle w:val="Heading1"/>
-      </w:pPr>
-      <w:r>
-        <w:t>5. Operations &amp; Timeline</w:t>
+        <w:t>6.1 P&amp;L ($ thousands)</w:t>
       </w:r>
     </w:p>
     <w:tbl>
@@ -934,168 +1058,50 @@
         <w:tblLook w:firstColumn="1" w:firstRow="1" w:lastColumn="0" w:lastRow="0" w:noHBand="0" w:noVBand="1" w:val="04A0"/>
       </w:tblPr>
       <w:tblGrid>
-        <w:gridCol w:w="2880"/>
-        <w:gridCol w:w="2880"/>
-        <w:gridCol w:w="2880"/>
+        <w:gridCol w:w="1440"/>
+        <w:gridCol w:w="1440"/>
+        <w:gridCol w:w="1440"/>
+        <w:gridCol w:w="1440"/>
+        <w:gridCol w:w="1440"/>
+        <w:gridCol w:w="1440"/>
       </w:tblGrid>
       <w:tr>
         <w:tc>
           <w:tcPr>
-            <w:tcW w:type="dxa" w:w="1584"/>
+            <w:tcW w:type="dxa" w:w="3024"/>
           </w:tcPr>
           <w:p>
-            <w:r/>
             <w:r>
               <w:rPr>
                 <w:b/>
                 <w:sz w:val="19"/>
               </w:rPr>
-              <w:t>Phase</w:t>
+              <w:t>Line</w:t>
             </w:r>
           </w:p>
         </w:tc>
         <w:tc>
           <w:tcPr>
-            <w:tcW w:type="dxa" w:w="2448"/>
+            <w:tcW w:type="dxa" w:w="1152"/>
           </w:tcPr>
           <w:p>
-            <w:r/>
             <w:r>
               <w:rPr>
                 <w:b/>
                 <w:sz w:val="19"/>
               </w:rPr>
-              <w:t>Window</w:t>
+              <w:t>2026</w:t>
             </w:r>
           </w:p>
         </w:tc>
         <w:tc>
           <w:tcPr>
-            <w:tcW w:type="dxa" w:w="5328"/>
+            <w:tcW w:type="dxa" w:w="1152"/>
           </w:tcPr>
           <w:p>
-            <w:r/>
             <w:r>
               <w:rPr>
                 <w:b/>
-                <w:sz w:val="19"/>
-              </w:rPr>
-              <w:t>Milestones</w:t>
-            </w:r>
-          </w:p>
-        </w:tc>
-      </w:tr>
-      <w:tr>
-        <w:tc>
-          <w:tcPr>
-            <w:tcW w:type="dxa" w:w="1584"/>
-          </w:tcPr>
-          <w:p>
-            <w:r/>
-            <w:r>
-              <w:rPr>
-                <w:sz w:val="19"/>
-              </w:rPr>
-              <w:t>Preparation</w:t>
-            </w:r>
-          </w:p>
-        </w:tc>
-        <w:tc>
-          <w:tcPr>
-            <w:tcW w:type="dxa" w:w="2448"/>
-          </w:tcPr>
-          <w:p>
-            <w:r/>
-            <w:r>
-              <w:rPr>
-                <w:sz w:val="19"/>
-              </w:rPr>
-              <w:t>Jul 2026 – Jan 2027 (6–9 mo)</w:t>
-            </w:r>
-          </w:p>
-        </w:tc>
-        <w:tc>
-          <w:tcPr>
-            <w:tcW w:type="dxa" w:w="5328"/>
-          </w:tcPr>
-          <w:p>
-            <w:r/>
-            <w:r>
-              <w:rPr>
-                <w:sz w:val="19"/>
-              </w:rPr>
-              <w:t>Lab build-out, −80 °C cold-chain &amp; fill-finish qualification, QA/QC, first cosmetic registrations, hire core team, finalize JV/IP terms</w:t>
-            </w:r>
-          </w:p>
-        </w:tc>
-      </w:tr>
-      <w:tr>
-        <w:tc>
-          <w:tcPr>
-            <w:tcW w:type="dxa" w:w="1584"/>
-          </w:tcPr>
-          <w:p>
-            <w:r/>
-            <w:r>
-              <w:rPr>
-                <w:sz w:val="19"/>
-              </w:rPr>
-              <w:t>Launch</w:t>
-            </w:r>
-          </w:p>
-        </w:tc>
-        <w:tc>
-          <w:tcPr>
-            <w:tcW w:type="dxa" w:w="2448"/>
-          </w:tcPr>
-          <w:p>
-            <w:r/>
-            <w:r>
-              <w:rPr>
-                <w:sz w:val="19"/>
-              </w:rPr>
-              <w:t>Feb 2027</w:t>
-            </w:r>
-          </w:p>
-        </w:tc>
-        <w:tc>
-          <w:tcPr>
-            <w:tcW w:type="dxa" w:w="5328"/>
-          </w:tcPr>
-          <w:p>
-            <w:r/>
-            <w:r>
-              <w:rPr>
-                <w:sz w:val="19"/>
-              </w:rPr>
-              <w:t>First commercial sales (cosmetic skin-booster line); 2–3 products live</w:t>
-            </w:r>
-          </w:p>
-        </w:tc>
-      </w:tr>
-      <w:tr>
-        <w:tc>
-          <w:tcPr>
-            <w:tcW w:type="dxa" w:w="1584"/>
-          </w:tcPr>
-          <w:p>
-            <w:r/>
-            <w:r>
-              <w:rPr>
-                <w:sz w:val="19"/>
-              </w:rPr>
-              <w:t>Ramp</w:t>
-            </w:r>
-          </w:p>
-        </w:tc>
-        <w:tc>
-          <w:tcPr>
-            <w:tcW w:type="dxa" w:w="2448"/>
-          </w:tcPr>
-          <w:p>
-            <w:r/>
-            <w:r>
-              <w:rPr>
                 <w:sz w:val="19"/>
               </w:rPr>
               <w:t>2027</w:t>
@@ -1104,15 +1110,43 @@
         </w:tc>
         <w:tc>
           <w:tcPr>
-            <w:tcW w:type="dxa" w:w="5328"/>
+            <w:tcW w:type="dxa" w:w="1224"/>
           </w:tcPr>
           <w:p>
-            <w:r/>
             <w:r>
               <w:rPr>
+                <w:b/>
                 <w:sz w:val="19"/>
               </w:rPr>
-              <w:t>Add remaining products; reach 28K/mo exit run-rate</w:t>
+              <w:t>2028</w:t>
+            </w:r>
+          </w:p>
+        </w:tc>
+        <w:tc>
+          <w:tcPr>
+            <w:tcW w:type="dxa" w:w="1224"/>
+          </w:tcPr>
+          <w:p>
+            <w:r>
+              <w:rPr>
+                <w:b/>
+                <w:sz w:val="19"/>
+              </w:rPr>
+              <w:t>2029</w:t>
+            </w:r>
+          </w:p>
+        </w:tc>
+        <w:tc>
+          <w:tcPr>
+            <w:tcW w:type="dxa" w:w="1224"/>
+          </w:tcPr>
+          <w:p>
+            <w:r>
+              <w:rPr>
+                <w:b/>
+                <w:sz w:val="19"/>
+              </w:rPr>
+              <w:t>2030</w:t>
             </w:r>
           </w:p>
         </w:tc>
@@ -1120,43 +1154,1020 @@
       <w:tr>
         <w:tc>
           <w:tcPr>
-            <w:tcW w:type="dxa" w:w="1584"/>
+            <w:tcW w:type="dxa" w:w="3024"/>
           </w:tcPr>
           <w:p>
-            <w:r/>
             <w:r>
               <w:rPr>
                 <w:sz w:val="19"/>
               </w:rPr>
-              <w:t>Scale</w:t>
+              <w:t>Kit revenue ($32.50)</w:t>
             </w:r>
           </w:p>
         </w:tc>
         <w:tc>
           <w:tcPr>
-            <w:tcW w:type="dxa" w:w="2448"/>
+            <w:tcW w:type="dxa" w:w="1152"/>
           </w:tcPr>
           <w:p>
-            <w:r/>
             <w:r>
               <w:rPr>
                 <w:sz w:val="19"/>
               </w:rPr>
-              <w:t>2028–2030</w:t>
+              <w:t>0</w:t>
             </w:r>
           </w:p>
         </w:tc>
         <w:tc>
           <w:tcPr>
-            <w:tcW w:type="dxa" w:w="5328"/>
+            <w:tcW w:type="dxa" w:w="1152"/>
           </w:tcPr>
           <w:p>
-            <w:r/>
             <w:r>
               <w:rPr>
                 <w:sz w:val="19"/>
               </w:rPr>
-              <w:t>50K → 75K → 100K vials/month; begin FDA/KFDA medical pathway; likely Series A in 2028</w:t>
+              <w:t>4,810</w:t>
+            </w:r>
+          </w:p>
+        </w:tc>
+        <w:tc>
+          <w:tcPr>
+            <w:tcW w:type="dxa" w:w="1224"/>
+          </w:tcPr>
+          <w:p>
+            <w:r>
+              <w:rPr>
+                <w:sz w:val="19"/>
+              </w:rPr>
+              <w:t>19,500</w:t>
+            </w:r>
+          </w:p>
+        </w:tc>
+        <w:tc>
+          <w:tcPr>
+            <w:tcW w:type="dxa" w:w="1224"/>
+          </w:tcPr>
+          <w:p>
+            <w:r>
+              <w:rPr>
+                <w:sz w:val="19"/>
+              </w:rPr>
+              <w:t>29,250</w:t>
+            </w:r>
+          </w:p>
+        </w:tc>
+        <w:tc>
+          <w:tcPr>
+            <w:tcW w:type="dxa" w:w="1224"/>
+          </w:tcPr>
+          <w:p>
+            <w:r>
+              <w:rPr>
+                <w:sz w:val="19"/>
+              </w:rPr>
+              <w:t>39,000</w:t>
+            </w:r>
+          </w:p>
+        </w:tc>
+      </w:tr>
+      <w:tr>
+        <w:tc>
+          <w:tcPr>
+            <w:tcW w:type="dxa" w:w="3024"/>
+          </w:tcPr>
+          <w:p>
+            <w:r>
+              <w:rPr>
+                <w:sz w:val="19"/>
+              </w:rPr>
+              <w:t>Device revenue ($3k ASP)</w:t>
+            </w:r>
+          </w:p>
+        </w:tc>
+        <w:tc>
+          <w:tcPr>
+            <w:tcW w:type="dxa" w:w="1152"/>
+          </w:tcPr>
+          <w:p>
+            <w:r>
+              <w:rPr>
+                <w:sz w:val="19"/>
+              </w:rPr>
+              <w:t>0</w:t>
+            </w:r>
+          </w:p>
+        </w:tc>
+        <w:tc>
+          <w:tcPr>
+            <w:tcW w:type="dxa" w:w="1152"/>
+          </w:tcPr>
+          <w:p>
+            <w:r>
+              <w:rPr>
+                <w:sz w:val="19"/>
+              </w:rPr>
+              <w:t>450</w:t>
+            </w:r>
+          </w:p>
+        </w:tc>
+        <w:tc>
+          <w:tcPr>
+            <w:tcW w:type="dxa" w:w="1224"/>
+          </w:tcPr>
+          <w:p>
+            <w:r>
+              <w:rPr>
+                <w:sz w:val="19"/>
+              </w:rPr>
+              <w:t>750</w:t>
+            </w:r>
+          </w:p>
+        </w:tc>
+        <w:tc>
+          <w:tcPr>
+            <w:tcW w:type="dxa" w:w="1224"/>
+          </w:tcPr>
+          <w:p>
+            <w:r>
+              <w:rPr>
+                <w:sz w:val="19"/>
+              </w:rPr>
+              <w:t>900</w:t>
+            </w:r>
+          </w:p>
+        </w:tc>
+        <w:tc>
+          <w:tcPr>
+            <w:tcW w:type="dxa" w:w="1224"/>
+          </w:tcPr>
+          <w:p>
+            <w:r>
+              <w:rPr>
+                <w:sz w:val="19"/>
+              </w:rPr>
+              <w:t>900</w:t>
+            </w:r>
+          </w:p>
+        </w:tc>
+      </w:tr>
+      <w:tr>
+        <w:tc>
+          <w:tcPr>
+            <w:tcW w:type="dxa" w:w="3024"/>
+          </w:tcPr>
+          <w:p>
+            <w:r>
+              <w:rPr>
+                <w:sz w:val="19"/>
+              </w:rPr>
+              <w:t>Total revenue</w:t>
+            </w:r>
+          </w:p>
+        </w:tc>
+        <w:tc>
+          <w:tcPr>
+            <w:tcW w:type="dxa" w:w="1152"/>
+          </w:tcPr>
+          <w:p>
+            <w:r>
+              <w:rPr>
+                <w:sz w:val="19"/>
+              </w:rPr>
+              <w:t>0</w:t>
+            </w:r>
+          </w:p>
+        </w:tc>
+        <w:tc>
+          <w:tcPr>
+            <w:tcW w:type="dxa" w:w="1152"/>
+          </w:tcPr>
+          <w:p>
+            <w:r>
+              <w:rPr>
+                <w:sz w:val="19"/>
+              </w:rPr>
+              <w:t>5,260</w:t>
+            </w:r>
+          </w:p>
+        </w:tc>
+        <w:tc>
+          <w:tcPr>
+            <w:tcW w:type="dxa" w:w="1224"/>
+          </w:tcPr>
+          <w:p>
+            <w:r>
+              <w:rPr>
+                <w:sz w:val="19"/>
+              </w:rPr>
+              <w:t>20,250</w:t>
+            </w:r>
+          </w:p>
+        </w:tc>
+        <w:tc>
+          <w:tcPr>
+            <w:tcW w:type="dxa" w:w="1224"/>
+          </w:tcPr>
+          <w:p>
+            <w:r>
+              <w:rPr>
+                <w:sz w:val="19"/>
+              </w:rPr>
+              <w:t>30,150</w:t>
+            </w:r>
+          </w:p>
+        </w:tc>
+        <w:tc>
+          <w:tcPr>
+            <w:tcW w:type="dxa" w:w="1224"/>
+          </w:tcPr>
+          <w:p>
+            <w:r>
+              <w:rPr>
+                <w:sz w:val="19"/>
+              </w:rPr>
+              <w:t>39,900</w:t>
+            </w:r>
+          </w:p>
+        </w:tc>
+      </w:tr>
+      <w:tr>
+        <w:tc>
+          <w:tcPr>
+            <w:tcW w:type="dxa" w:w="3024"/>
+          </w:tcPr>
+          <w:p>
+            <w:r>
+              <w:rPr>
+                <w:sz w:val="19"/>
+              </w:rPr>
+              <w:t>Kit gross profit (66.2%)</w:t>
+            </w:r>
+          </w:p>
+        </w:tc>
+        <w:tc>
+          <w:tcPr>
+            <w:tcW w:type="dxa" w:w="1152"/>
+          </w:tcPr>
+          <w:p>
+            <w:r>
+              <w:rPr>
+                <w:sz w:val="19"/>
+              </w:rPr>
+              <w:t>0</w:t>
+            </w:r>
+          </w:p>
+        </w:tc>
+        <w:tc>
+          <w:tcPr>
+            <w:tcW w:type="dxa" w:w="1152"/>
+          </w:tcPr>
+          <w:p>
+            <w:r>
+              <w:rPr>
+                <w:sz w:val="19"/>
+              </w:rPr>
+              <w:t>3,182</w:t>
+            </w:r>
+          </w:p>
+        </w:tc>
+        <w:tc>
+          <w:tcPr>
+            <w:tcW w:type="dxa" w:w="1224"/>
+          </w:tcPr>
+          <w:p>
+            <w:r>
+              <w:rPr>
+                <w:sz w:val="19"/>
+              </w:rPr>
+              <w:t>12,900</w:t>
+            </w:r>
+          </w:p>
+        </w:tc>
+        <w:tc>
+          <w:tcPr>
+            <w:tcW w:type="dxa" w:w="1224"/>
+          </w:tcPr>
+          <w:p>
+            <w:r>
+              <w:rPr>
+                <w:sz w:val="19"/>
+              </w:rPr>
+              <w:t>19,350</w:t>
+            </w:r>
+          </w:p>
+        </w:tc>
+        <w:tc>
+          <w:tcPr>
+            <w:tcW w:type="dxa" w:w="1224"/>
+          </w:tcPr>
+          <w:p>
+            <w:r>
+              <w:rPr>
+                <w:sz w:val="19"/>
+              </w:rPr>
+              <w:t>25,800</w:t>
+            </w:r>
+          </w:p>
+        </w:tc>
+      </w:tr>
+      <w:tr>
+        <w:tc>
+          <w:tcPr>
+            <w:tcW w:type="dxa" w:w="3024"/>
+          </w:tcPr>
+          <w:p>
+            <w:r>
+              <w:rPr>
+                <w:sz w:val="19"/>
+              </w:rPr>
+              <w:t>Device gross profit (40%)</w:t>
+            </w:r>
+          </w:p>
+        </w:tc>
+        <w:tc>
+          <w:tcPr>
+            <w:tcW w:type="dxa" w:w="1152"/>
+          </w:tcPr>
+          <w:p>
+            <w:r>
+              <w:rPr>
+                <w:sz w:val="19"/>
+              </w:rPr>
+              <w:t>0</w:t>
+            </w:r>
+          </w:p>
+        </w:tc>
+        <w:tc>
+          <w:tcPr>
+            <w:tcW w:type="dxa" w:w="1152"/>
+          </w:tcPr>
+          <w:p>
+            <w:r>
+              <w:rPr>
+                <w:sz w:val="19"/>
+              </w:rPr>
+              <w:t>180</w:t>
+            </w:r>
+          </w:p>
+        </w:tc>
+        <w:tc>
+          <w:tcPr>
+            <w:tcW w:type="dxa" w:w="1224"/>
+          </w:tcPr>
+          <w:p>
+            <w:r>
+              <w:rPr>
+                <w:sz w:val="19"/>
+              </w:rPr>
+              <w:t>300</w:t>
+            </w:r>
+          </w:p>
+        </w:tc>
+        <w:tc>
+          <w:tcPr>
+            <w:tcW w:type="dxa" w:w="1224"/>
+          </w:tcPr>
+          <w:p>
+            <w:r>
+              <w:rPr>
+                <w:sz w:val="19"/>
+              </w:rPr>
+              <w:t>360</w:t>
+            </w:r>
+          </w:p>
+        </w:tc>
+        <w:tc>
+          <w:tcPr>
+            <w:tcW w:type="dxa" w:w="1224"/>
+          </w:tcPr>
+          <w:p>
+            <w:r>
+              <w:rPr>
+                <w:sz w:val="19"/>
+              </w:rPr>
+              <w:t>360</w:t>
+            </w:r>
+          </w:p>
+        </w:tc>
+      </w:tr>
+      <w:tr>
+        <w:tc>
+          <w:tcPr>
+            <w:tcW w:type="dxa" w:w="3024"/>
+          </w:tcPr>
+          <w:p>
+            <w:r>
+              <w:rPr>
+                <w:sz w:val="19"/>
+              </w:rPr>
+              <w:t>Total gross profit</w:t>
+            </w:r>
+          </w:p>
+        </w:tc>
+        <w:tc>
+          <w:tcPr>
+            <w:tcW w:type="dxa" w:w="1152"/>
+          </w:tcPr>
+          <w:p>
+            <w:r>
+              <w:rPr>
+                <w:sz w:val="19"/>
+              </w:rPr>
+              <w:t>0</w:t>
+            </w:r>
+          </w:p>
+        </w:tc>
+        <w:tc>
+          <w:tcPr>
+            <w:tcW w:type="dxa" w:w="1152"/>
+          </w:tcPr>
+          <w:p>
+            <w:r>
+              <w:rPr>
+                <w:sz w:val="19"/>
+              </w:rPr>
+              <w:t>3,362</w:t>
+            </w:r>
+          </w:p>
+        </w:tc>
+        <w:tc>
+          <w:tcPr>
+            <w:tcW w:type="dxa" w:w="1224"/>
+          </w:tcPr>
+          <w:p>
+            <w:r>
+              <w:rPr>
+                <w:sz w:val="19"/>
+              </w:rPr>
+              <w:t>13,200</w:t>
+            </w:r>
+          </w:p>
+        </w:tc>
+        <w:tc>
+          <w:tcPr>
+            <w:tcW w:type="dxa" w:w="1224"/>
+          </w:tcPr>
+          <w:p>
+            <w:r>
+              <w:rPr>
+                <w:sz w:val="19"/>
+              </w:rPr>
+              <w:t>19,710</w:t>
+            </w:r>
+          </w:p>
+        </w:tc>
+        <w:tc>
+          <w:tcPr>
+            <w:tcW w:type="dxa" w:w="1224"/>
+          </w:tcPr>
+          <w:p>
+            <w:r>
+              <w:rPr>
+                <w:sz w:val="19"/>
+              </w:rPr>
+              <w:t>26,160</w:t>
+            </w:r>
+          </w:p>
+        </w:tc>
+      </w:tr>
+      <w:tr>
+        <w:tc>
+          <w:tcPr>
+            <w:tcW w:type="dxa" w:w="3024"/>
+          </w:tcPr>
+          <w:p>
+            <w:r>
+              <w:rPr>
+                <w:sz w:val="19"/>
+              </w:rPr>
+              <w:t>Blended gross margin</w:t>
+            </w:r>
+          </w:p>
+        </w:tc>
+        <w:tc>
+          <w:tcPr>
+            <w:tcW w:type="dxa" w:w="1152"/>
+          </w:tcPr>
+          <w:p>
+            <w:r>
+              <w:rPr>
+                <w:sz w:val="19"/>
+              </w:rPr>
+              <w:t>—</w:t>
+            </w:r>
+          </w:p>
+        </w:tc>
+        <w:tc>
+          <w:tcPr>
+            <w:tcW w:type="dxa" w:w="1152"/>
+          </w:tcPr>
+          <w:p>
+            <w:r>
+              <w:rPr>
+                <w:sz w:val="19"/>
+              </w:rPr>
+              <w:t>63.9%</w:t>
+            </w:r>
+          </w:p>
+        </w:tc>
+        <w:tc>
+          <w:tcPr>
+            <w:tcW w:type="dxa" w:w="1224"/>
+          </w:tcPr>
+          <w:p>
+            <w:r>
+              <w:rPr>
+                <w:sz w:val="19"/>
+              </w:rPr>
+              <w:t>65.2%</w:t>
+            </w:r>
+          </w:p>
+        </w:tc>
+        <w:tc>
+          <w:tcPr>
+            <w:tcW w:type="dxa" w:w="1224"/>
+          </w:tcPr>
+          <w:p>
+            <w:r>
+              <w:rPr>
+                <w:sz w:val="19"/>
+              </w:rPr>
+              <w:t>65.4%</w:t>
+            </w:r>
+          </w:p>
+        </w:tc>
+        <w:tc>
+          <w:tcPr>
+            <w:tcW w:type="dxa" w:w="1224"/>
+          </w:tcPr>
+          <w:p>
+            <w:r>
+              <w:rPr>
+                <w:sz w:val="19"/>
+              </w:rPr>
+              <w:t>65.6%</w:t>
+            </w:r>
+          </w:p>
+        </w:tc>
+      </w:tr>
+      <w:tr>
+        <w:tc>
+          <w:tcPr>
+            <w:tcW w:type="dxa" w:w="3024"/>
+          </w:tcPr>
+          <w:p>
+            <w:r>
+              <w:rPr>
+                <w:sz w:val="19"/>
+              </w:rPr>
+              <w:t>OpEx (sales, reg, R&amp;D incl. AI, G&amp;A)</w:t>
+            </w:r>
+          </w:p>
+        </w:tc>
+        <w:tc>
+          <w:tcPr>
+            <w:tcW w:type="dxa" w:w="1152"/>
+          </w:tcPr>
+          <w:p>
+            <w:r>
+              <w:rPr>
+                <w:sz w:val="19"/>
+              </w:rPr>
+              <w:t>700</w:t>
+            </w:r>
+          </w:p>
+        </w:tc>
+        <w:tc>
+          <w:tcPr>
+            <w:tcW w:type="dxa" w:w="1152"/>
+          </w:tcPr>
+          <w:p>
+            <w:r>
+              <w:rPr>
+                <w:sz w:val="19"/>
+              </w:rPr>
+              <w:t>2,600</w:t>
+            </w:r>
+          </w:p>
+        </w:tc>
+        <w:tc>
+          <w:tcPr>
+            <w:tcW w:type="dxa" w:w="1224"/>
+          </w:tcPr>
+          <w:p>
+            <w:r>
+              <w:rPr>
+                <w:sz w:val="19"/>
+              </w:rPr>
+              <w:t>6,000</w:t>
+            </w:r>
+          </w:p>
+        </w:tc>
+        <w:tc>
+          <w:tcPr>
+            <w:tcW w:type="dxa" w:w="1224"/>
+          </w:tcPr>
+          <w:p>
+            <w:r>
+              <w:rPr>
+                <w:sz w:val="19"/>
+              </w:rPr>
+              <w:t>8,200</w:t>
+            </w:r>
+          </w:p>
+        </w:tc>
+        <w:tc>
+          <w:tcPr>
+            <w:tcW w:type="dxa" w:w="1224"/>
+          </w:tcPr>
+          <w:p>
+            <w:r>
+              <w:rPr>
+                <w:sz w:val="19"/>
+              </w:rPr>
+              <w:t>10,000</w:t>
+            </w:r>
+          </w:p>
+        </w:tc>
+      </w:tr>
+      <w:tr>
+        <w:tc>
+          <w:tcPr>
+            <w:tcW w:type="dxa" w:w="3024"/>
+          </w:tcPr>
+          <w:p>
+            <w:r>
+              <w:rPr>
+                <w:sz w:val="19"/>
+              </w:rPr>
+              <w:t>EBITDA</w:t>
+            </w:r>
+          </w:p>
+        </w:tc>
+        <w:tc>
+          <w:tcPr>
+            <w:tcW w:type="dxa" w:w="1152"/>
+          </w:tcPr>
+          <w:p>
+            <w:r>
+              <w:rPr>
+                <w:sz w:val="19"/>
+              </w:rPr>
+              <w:t>(700)</w:t>
+            </w:r>
+          </w:p>
+        </w:tc>
+        <w:tc>
+          <w:tcPr>
+            <w:tcW w:type="dxa" w:w="1152"/>
+          </w:tcPr>
+          <w:p>
+            <w:r>
+              <w:rPr>
+                <w:sz w:val="19"/>
+              </w:rPr>
+              <w:t>762</w:t>
+            </w:r>
+          </w:p>
+        </w:tc>
+        <w:tc>
+          <w:tcPr>
+            <w:tcW w:type="dxa" w:w="1224"/>
+          </w:tcPr>
+          <w:p>
+            <w:r>
+              <w:rPr>
+                <w:sz w:val="19"/>
+              </w:rPr>
+              <w:t>7,200</w:t>
+            </w:r>
+          </w:p>
+        </w:tc>
+        <w:tc>
+          <w:tcPr>
+            <w:tcW w:type="dxa" w:w="1224"/>
+          </w:tcPr>
+          <w:p>
+            <w:r>
+              <w:rPr>
+                <w:sz w:val="19"/>
+              </w:rPr>
+              <w:t>11,510</w:t>
+            </w:r>
+          </w:p>
+        </w:tc>
+        <w:tc>
+          <w:tcPr>
+            <w:tcW w:type="dxa" w:w="1224"/>
+          </w:tcPr>
+          <w:p>
+            <w:r>
+              <w:rPr>
+                <w:sz w:val="19"/>
+              </w:rPr>
+              <w:t>16,160</w:t>
+            </w:r>
+          </w:p>
+        </w:tc>
+      </w:tr>
+    </w:tbl>
+    <w:p>
+      <w:pPr>
+        <w:spacing w:after="40"/>
+      </w:pPr>
+    </w:p>
+    <w:p>
+      <w:pPr>
+        <w:pStyle w:val="Heading2"/>
+      </w:pPr>
+      <w:r>
+        <w:t>6.2 Scenarios (2029)</w:t>
+      </w:r>
+    </w:p>
+    <w:tbl>
+      <w:tblPr>
+        <w:tblStyle w:val="LightGrid-Accent1"/>
+        <w:tblW w:type="auto" w:w="0"/>
+        <w:jc w:val="center"/>
+        <w:tblLook w:firstColumn="1" w:firstRow="1" w:lastColumn="0" w:lastRow="0" w:noHBand="0" w:noVBand="1" w:val="04A0"/>
+      </w:tblPr>
+      <w:tblGrid>
+        <w:gridCol w:w="1728"/>
+        <w:gridCol w:w="1728"/>
+        <w:gridCol w:w="1728"/>
+        <w:gridCol w:w="1728"/>
+        <w:gridCol w:w="1728"/>
+      </w:tblGrid>
+      <w:tr>
+        <w:tc>
+          <w:tcPr>
+            <w:tcW w:type="dxa" w:w="1872"/>
+          </w:tcPr>
+          <w:p>
+            <w:r>
+              <w:rPr>
+                <w:b/>
+                <w:sz w:val="19"/>
+              </w:rPr>
+              <w:t>Scenario</w:t>
+            </w:r>
+          </w:p>
+        </w:tc>
+        <w:tc>
+          <w:tcPr>
+            <w:tcW w:type="dxa" w:w="1440"/>
+          </w:tcPr>
+          <w:p>
+            <w:r>
+              <w:rPr>
+                <w:b/>
+                <w:sz w:val="19"/>
+              </w:rPr>
+              <w:t>Clinics</w:t>
+            </w:r>
+          </w:p>
+        </w:tc>
+        <w:tc>
+          <w:tcPr>
+            <w:tcW w:type="dxa" w:w="1296"/>
+          </w:tcPr>
+          <w:p>
+            <w:r>
+              <w:rPr>
+                <w:b/>
+                <w:sz w:val="19"/>
+              </w:rPr>
+              <w:t>EXW</w:t>
+            </w:r>
+          </w:p>
+        </w:tc>
+        <w:tc>
+          <w:tcPr>
+            <w:tcW w:type="dxa" w:w="1584"/>
+          </w:tcPr>
+          <w:p>
+            <w:r>
+              <w:rPr>
+                <w:b/>
+                <w:sz w:val="19"/>
+              </w:rPr>
+              <w:t>Revenue</w:t>
+            </w:r>
+          </w:p>
+        </w:tc>
+        <w:tc>
+          <w:tcPr>
+            <w:tcW w:type="dxa" w:w="1584"/>
+          </w:tcPr>
+          <w:p>
+            <w:r>
+              <w:rPr>
+                <w:b/>
+                <w:sz w:val="19"/>
+              </w:rPr>
+              <w:t>Gross profit</w:t>
+            </w:r>
+          </w:p>
+        </w:tc>
+      </w:tr>
+      <w:tr>
+        <w:tc>
+          <w:tcPr>
+            <w:tcW w:type="dxa" w:w="1872"/>
+          </w:tcPr>
+          <w:p>
+            <w:r>
+              <w:rPr>
+                <w:sz w:val="19"/>
+              </w:rPr>
+              <w:t>Conservative</w:t>
+            </w:r>
+          </w:p>
+        </w:tc>
+        <w:tc>
+          <w:tcPr>
+            <w:tcW w:type="dxa" w:w="1440"/>
+          </w:tcPr>
+          <w:p>
+            <w:r>
+              <w:rPr>
+                <w:sz w:val="19"/>
+              </w:rPr>
+              <w:t>~500</w:t>
+            </w:r>
+          </w:p>
+        </w:tc>
+        <w:tc>
+          <w:tcPr>
+            <w:tcW w:type="dxa" w:w="1296"/>
+          </w:tcPr>
+          <w:p>
+            <w:r>
+              <w:rPr>
+                <w:sz w:val="19"/>
+              </w:rPr>
+              <w:t>$30</w:t>
+            </w:r>
+          </w:p>
+        </w:tc>
+        <w:tc>
+          <w:tcPr>
+            <w:tcW w:type="dxa" w:w="1584"/>
+          </w:tcPr>
+          <w:p>
+            <w:r>
+              <w:rPr>
+                <w:sz w:val="19"/>
+              </w:rPr>
+              <w:t>~$22M</w:t>
+            </w:r>
+          </w:p>
+        </w:tc>
+        <w:tc>
+          <w:tcPr>
+            <w:tcW w:type="dxa" w:w="1584"/>
+          </w:tcPr>
+          <w:p>
+            <w:r>
+              <w:rPr>
+                <w:sz w:val="19"/>
+              </w:rPr>
+              <w:t>~$14M</w:t>
+            </w:r>
+          </w:p>
+        </w:tc>
+      </w:tr>
+      <w:tr>
+        <w:tc>
+          <w:tcPr>
+            <w:tcW w:type="dxa" w:w="1872"/>
+          </w:tcPr>
+          <w:p>
+            <w:r>
+              <w:rPr>
+                <w:sz w:val="19"/>
+              </w:rPr>
+              <w:t>Base</w:t>
+            </w:r>
+          </w:p>
+        </w:tc>
+        <w:tc>
+          <w:tcPr>
+            <w:tcW w:type="dxa" w:w="1440"/>
+          </w:tcPr>
+          <w:p>
+            <w:r>
+              <w:rPr>
+                <w:sz w:val="19"/>
+              </w:rPr>
+              <w:t>700</w:t>
+            </w:r>
+          </w:p>
+        </w:tc>
+        <w:tc>
+          <w:tcPr>
+            <w:tcW w:type="dxa" w:w="1296"/>
+          </w:tcPr>
+          <w:p>
+            <w:r>
+              <w:rPr>
+                <w:sz w:val="19"/>
+              </w:rPr>
+              <w:t>$32.50</w:t>
+            </w:r>
+          </w:p>
+        </w:tc>
+        <w:tc>
+          <w:tcPr>
+            <w:tcW w:type="dxa" w:w="1584"/>
+          </w:tcPr>
+          <w:p>
+            <w:r>
+              <w:rPr>
+                <w:sz w:val="19"/>
+              </w:rPr>
+              <w:t>$30.2M</w:t>
+            </w:r>
+          </w:p>
+        </w:tc>
+        <w:tc>
+          <w:tcPr>
+            <w:tcW w:type="dxa" w:w="1584"/>
+          </w:tcPr>
+          <w:p>
+            <w:r>
+              <w:rPr>
+                <w:sz w:val="19"/>
+              </w:rPr>
+              <w:t>$19.7M</w:t>
+            </w:r>
+          </w:p>
+        </w:tc>
+      </w:tr>
+      <w:tr>
+        <w:tc>
+          <w:tcPr>
+            <w:tcW w:type="dxa" w:w="1872"/>
+          </w:tcPr>
+          <w:p>
+            <w:r>
+              <w:rPr>
+                <w:sz w:val="19"/>
+              </w:rPr>
+              <w:t>Upside</w:t>
+            </w:r>
+          </w:p>
+        </w:tc>
+        <w:tc>
+          <w:tcPr>
+            <w:tcW w:type="dxa" w:w="1440"/>
+          </w:tcPr>
+          <w:p>
+            <w:r>
+              <w:rPr>
+                <w:sz w:val="19"/>
+              </w:rPr>
+              <w:t>~850</w:t>
+            </w:r>
+          </w:p>
+        </w:tc>
+        <w:tc>
+          <w:tcPr>
+            <w:tcW w:type="dxa" w:w="1296"/>
+          </w:tcPr>
+          <w:p>
+            <w:r>
+              <w:rPr>
+                <w:sz w:val="19"/>
+              </w:rPr>
+              <w:t>$35</w:t>
+            </w:r>
+          </w:p>
+        </w:tc>
+        <w:tc>
+          <w:tcPr>
+            <w:tcW w:type="dxa" w:w="1584"/>
+          </w:tcPr>
+          <w:p>
+            <w:r>
+              <w:rPr>
+                <w:sz w:val="19"/>
+              </w:rPr>
+              <w:t>~$38M</w:t>
+            </w:r>
+          </w:p>
+        </w:tc>
+        <w:tc>
+          <w:tcPr>
+            <w:tcW w:type="dxa" w:w="1584"/>
+          </w:tcPr>
+          <w:p>
+            <w:r>
+              <w:rPr>
+                <w:sz w:val="19"/>
+              </w:rPr>
+              <w:t>~$25M</w:t>
             </w:r>
           </w:p>
         </w:tc>
@@ -1177,7 +2188,7 @@
           <w:i/>
           <w:sz w:val="19"/>
         </w:rPr>
-        <w:t>Cold chain matters: SynExo is stable 12 months at −80 °C. Ultra-cold storage, validated shipping, and stability/QC are real cost and logistics lines — budgeted within the manufacturing cost formula (confirm with Eyesel).</w:t>
+        <w:t>Pillar-3 data monetisation (model/insight licensing, outcome analytics) is excluded from the base P&amp;L and treated as upside.</w:t>
       </w:r>
     </w:p>
     <w:p>
@@ -1185,7 +2196,20 @@
         <w:pStyle w:val="Heading1"/>
       </w:pPr>
       <w:r>
-        <w:t>6. Financial Model</w:t>
+        <w:t>7. Valuation — Two Lenses</w:t>
+      </w:r>
+    </w:p>
+    <w:p>
+      <w:pPr>
+        <w:spacing w:after="40"/>
+      </w:pPr>
+      <w:r>
+        <w:rPr>
+          <w:b/>
+          <w:i w:val="0"/>
+          <w:sz w:val="21"/>
+        </w:rPr>
+        <w:t>Lens A — device + consumables business (the floor; sets the kickoff price).</w:t>
       </w:r>
     </w:p>
     <w:p>
@@ -1198,1553 +2222,20 @@
           <w:i w:val="0"/>
           <w:sz w:val="21"/>
         </w:rPr>
-        <w:t>Base case: EXW $32.50 (midpoint of $30–35), material cost $4.50/vial (confirmed &lt; $5). All figures USD; illustrative projections.</w:t>
+        <w:t>Recommend $5–7M pre-money / $6–8M post, $6M midpoint → $1.0M buys ~14.3%. Three methods reconcile: seed convention for an IP-owning JV ($5–7M); DCF (40% discount, 8× EBITDA exit) ≈ $35M un-risk-adjusted EV → ~$5–7M risk-adjusted; forward multiple. Recurring medical consumables + regulatory moat support the upper half and a higher revenue multiple (3–6×).</w:t>
       </w:r>
     </w:p>
     <w:p>
       <w:pPr>
-        <w:pStyle w:val="Heading2"/>
-      </w:pPr>
-      <w:r>
-        <w:t>6.1 Unit economics (per vial)</w:t>
-      </w:r>
-    </w:p>
-    <w:p>
-      <w:pPr>
-        <w:spacing w:after="120"/>
+        <w:spacing w:after="40"/>
       </w:pPr>
       <w:r>
         <w:rPr>
-          <w:b w:val="0"/>
-          <w:i/>
-          <w:sz w:val="19"/>
+          <w:b/>
+          <w:i w:val="0"/>
+          <w:sz w:val="21"/>
         </w:rPr>
-        <w:t>Cost formula (as given): COGS = (10% × EXW) + material cost + (10% × EXW) = 20% × EXW + material.</w:t>
-      </w:r>
-    </w:p>
-    <w:tbl>
-      <w:tblPr>
-        <w:tblStyle w:val="LightGrid-Accent1"/>
-        <w:tblW w:type="auto" w:w="0"/>
-        <w:jc w:val="center"/>
-        <w:tblLook w:firstColumn="1" w:firstRow="1" w:lastColumn="0" w:lastRow="0" w:noHBand="0" w:noVBand="1" w:val="04A0"/>
-      </w:tblPr>
-      <w:tblGrid>
-        <w:gridCol w:w="4320"/>
-        <w:gridCol w:w="4320"/>
-      </w:tblGrid>
-      <w:tr>
-        <w:tc>
-          <w:tcPr>
-            <w:tcW w:type="dxa" w:w="4608"/>
-          </w:tcPr>
-          <w:p>
-            <w:r/>
-            <w:r>
-              <w:rPr>
-                <w:b/>
-                <w:sz w:val="19"/>
-              </w:rPr>
-              <w:t>Line</w:t>
-            </w:r>
-          </w:p>
-        </w:tc>
-        <w:tc>
-          <w:tcPr>
-            <w:tcW w:type="dxa" w:w="2016"/>
-          </w:tcPr>
-          <w:p>
-            <w:r/>
-            <w:r>
-              <w:rPr>
-                <w:b/>
-                <w:sz w:val="19"/>
-              </w:rPr>
-              <w:t>$ / vial</w:t>
-            </w:r>
-          </w:p>
-        </w:tc>
-      </w:tr>
-      <w:tr>
-        <w:tc>
-          <w:tcPr>
-            <w:tcW w:type="dxa" w:w="4608"/>
-          </w:tcPr>
-          <w:p>
-            <w:r/>
-            <w:r>
-              <w:rPr>
-                <w:sz w:val="19"/>
-              </w:rPr>
-              <w:t>Ex-factory price (EXW)</w:t>
-            </w:r>
-          </w:p>
-        </w:tc>
-        <w:tc>
-          <w:tcPr>
-            <w:tcW w:type="dxa" w:w="2016"/>
-          </w:tcPr>
-          <w:p>
-            <w:r/>
-            <w:r>
-              <w:rPr>
-                <w:sz w:val="19"/>
-              </w:rPr>
-              <w:t>32.50</w:t>
-            </w:r>
-          </w:p>
-        </w:tc>
-      </w:tr>
-      <w:tr>
-        <w:tc>
-          <w:tcPr>
-            <w:tcW w:type="dxa" w:w="4608"/>
-          </w:tcPr>
-          <w:p>
-            <w:r/>
-            <w:r>
-              <w:rPr>
-                <w:sz w:val="19"/>
-              </w:rPr>
-              <w:t>– Manufacturing (10% × EXW)</w:t>
-            </w:r>
-          </w:p>
-        </w:tc>
-        <w:tc>
-          <w:tcPr>
-            <w:tcW w:type="dxa" w:w="2016"/>
-          </w:tcPr>
-          <w:p>
-            <w:r/>
-            <w:r>
-              <w:rPr>
-                <w:sz w:val="19"/>
-              </w:rPr>
-              <w:t>3.25</w:t>
-            </w:r>
-          </w:p>
-        </w:tc>
-      </w:tr>
-      <w:tr>
-        <w:tc>
-          <w:tcPr>
-            <w:tcW w:type="dxa" w:w="4608"/>
-          </w:tcPr>
-          <w:p>
-            <w:r/>
-            <w:r>
-              <w:rPr>
-                <w:sz w:val="19"/>
-              </w:rPr>
-              <w:t>– Material cost</w:t>
-            </w:r>
-          </w:p>
-        </w:tc>
-        <w:tc>
-          <w:tcPr>
-            <w:tcW w:type="dxa" w:w="2016"/>
-          </w:tcPr>
-          <w:p>
-            <w:r/>
-            <w:r>
-              <w:rPr>
-                <w:sz w:val="19"/>
-              </w:rPr>
-              <w:t>4.50</w:t>
-            </w:r>
-          </w:p>
-        </w:tc>
-      </w:tr>
-      <w:tr>
-        <w:tc>
-          <w:tcPr>
-            <w:tcW w:type="dxa" w:w="4608"/>
-          </w:tcPr>
-          <w:p>
-            <w:r/>
-            <w:r>
-              <w:rPr>
-                <w:sz w:val="19"/>
-              </w:rPr>
-              <w:t>– Second 10% (10% × EXW)</w:t>
-            </w:r>
-          </w:p>
-        </w:tc>
-        <w:tc>
-          <w:tcPr>
-            <w:tcW w:type="dxa" w:w="2016"/>
-          </w:tcPr>
-          <w:p>
-            <w:r/>
-            <w:r>
-              <w:rPr>
-                <w:sz w:val="19"/>
-              </w:rPr>
-              <w:t>3.25</w:t>
-            </w:r>
-          </w:p>
-        </w:tc>
-      </w:tr>
-      <w:tr>
-        <w:tc>
-          <w:tcPr>
-            <w:tcW w:type="dxa" w:w="4608"/>
-          </w:tcPr>
-          <w:p>
-            <w:r/>
-            <w:r>
-              <w:rPr>
-                <w:sz w:val="19"/>
-              </w:rPr>
-              <w:t>= COGS</w:t>
-            </w:r>
-          </w:p>
-        </w:tc>
-        <w:tc>
-          <w:tcPr>
-            <w:tcW w:type="dxa" w:w="2016"/>
-          </w:tcPr>
-          <w:p>
-            <w:r/>
-            <w:r>
-              <w:rPr>
-                <w:sz w:val="19"/>
-              </w:rPr>
-              <w:t>11.00</w:t>
-            </w:r>
-          </w:p>
-        </w:tc>
-      </w:tr>
-      <w:tr>
-        <w:tc>
-          <w:tcPr>
-            <w:tcW w:type="dxa" w:w="4608"/>
-          </w:tcPr>
-          <w:p>
-            <w:r/>
-            <w:r>
-              <w:rPr>
-                <w:sz w:val="19"/>
-              </w:rPr>
-              <w:t>Gross profit / vial</w:t>
-            </w:r>
-          </w:p>
-        </w:tc>
-        <w:tc>
-          <w:tcPr>
-            <w:tcW w:type="dxa" w:w="2016"/>
-          </w:tcPr>
-          <w:p>
-            <w:r/>
-            <w:r>
-              <w:rPr>
-                <w:sz w:val="19"/>
-              </w:rPr>
-              <w:t>21.50</w:t>
-            </w:r>
-          </w:p>
-        </w:tc>
-      </w:tr>
-      <w:tr>
-        <w:tc>
-          <w:tcPr>
-            <w:tcW w:type="dxa" w:w="4608"/>
-          </w:tcPr>
-          <w:p>
-            <w:r/>
-            <w:r>
-              <w:rPr>
-                <w:sz w:val="19"/>
-              </w:rPr>
-              <w:t>Gross margin</w:t>
-            </w:r>
-          </w:p>
-        </w:tc>
-        <w:tc>
-          <w:tcPr>
-            <w:tcW w:type="dxa" w:w="2016"/>
-          </w:tcPr>
-          <w:p>
-            <w:r/>
-            <w:r>
-              <w:rPr>
-                <w:sz w:val="19"/>
-              </w:rPr>
-              <w:t>66.2%</w:t>
-            </w:r>
-          </w:p>
-        </w:tc>
-      </w:tr>
-    </w:tbl>
-    <w:p>
-      <w:pPr>
-        <w:spacing w:after="40"/>
-      </w:pPr>
-    </w:p>
-    <w:p>
-      <w:pPr>
-        <w:pStyle w:val="Heading2"/>
-      </w:pPr>
-      <w:r>
-        <w:t>6.2 Annual P&amp;L ($ thousands)</w:t>
-      </w:r>
-    </w:p>
-    <w:tbl>
-      <w:tblPr>
-        <w:tblStyle w:val="LightGrid-Accent1"/>
-        <w:tblW w:type="auto" w:w="0"/>
-        <w:jc w:val="center"/>
-        <w:tblLook w:firstColumn="1" w:firstRow="1" w:lastColumn="0" w:lastRow="0" w:noHBand="0" w:noVBand="1" w:val="04A0"/>
-      </w:tblPr>
-      <w:tblGrid>
-        <w:gridCol w:w="1440"/>
-        <w:gridCol w:w="1440"/>
-        <w:gridCol w:w="1440"/>
-        <w:gridCol w:w="1440"/>
-        <w:gridCol w:w="1440"/>
-        <w:gridCol w:w="1440"/>
-      </w:tblGrid>
-      <w:tr>
-        <w:tc>
-          <w:tcPr>
-            <w:tcW w:type="dxa" w:w="2304"/>
-          </w:tcPr>
-          <w:p>
-            <w:r/>
-            <w:r>
-              <w:rPr>
-                <w:b/>
-                <w:sz w:val="19"/>
-              </w:rPr>
-            </w:r>
-          </w:p>
-        </w:tc>
-        <w:tc>
-          <w:tcPr>
-            <w:tcW w:type="dxa" w:w="1440"/>
-          </w:tcPr>
-          <w:p>
-            <w:r/>
-            <w:r>
-              <w:rPr>
-                <w:b/>
-                <w:sz w:val="19"/>
-              </w:rPr>
-              <w:t>2026 prep</w:t>
-            </w:r>
-          </w:p>
-        </w:tc>
-        <w:tc>
-          <w:tcPr>
-            <w:tcW w:type="dxa" w:w="1296"/>
-          </w:tcPr>
-          <w:p>
-            <w:r/>
-            <w:r>
-              <w:rPr>
-                <w:b/>
-                <w:sz w:val="19"/>
-              </w:rPr>
-              <w:t>2027</w:t>
-            </w:r>
-          </w:p>
-        </w:tc>
-        <w:tc>
-          <w:tcPr>
-            <w:tcW w:type="dxa" w:w="1296"/>
-          </w:tcPr>
-          <w:p>
-            <w:r/>
-            <w:r>
-              <w:rPr>
-                <w:b/>
-                <w:sz w:val="19"/>
-              </w:rPr>
-              <w:t>2028</w:t>
-            </w:r>
-          </w:p>
-        </w:tc>
-        <w:tc>
-          <w:tcPr>
-            <w:tcW w:type="dxa" w:w="1296"/>
-          </w:tcPr>
-          <w:p>
-            <w:r/>
-            <w:r>
-              <w:rPr>
-                <w:b/>
-                <w:sz w:val="19"/>
-              </w:rPr>
-              <w:t>2029</w:t>
-            </w:r>
-          </w:p>
-        </w:tc>
-        <w:tc>
-          <w:tcPr>
-            <w:tcW w:type="dxa" w:w="1296"/>
-          </w:tcPr>
-          <w:p>
-            <w:r/>
-            <w:r>
-              <w:rPr>
-                <w:b/>
-                <w:sz w:val="19"/>
-              </w:rPr>
-              <w:t>2030</w:t>
-            </w:r>
-          </w:p>
-        </w:tc>
-      </w:tr>
-      <w:tr>
-        <w:tc>
-          <w:tcPr>
-            <w:tcW w:type="dxa" w:w="2304"/>
-          </w:tcPr>
-          <w:p>
-            <w:r/>
-            <w:r>
-              <w:rPr>
-                <w:sz w:val="19"/>
-              </w:rPr>
-              <w:t>Vials sold (000s)</w:t>
-            </w:r>
-          </w:p>
-        </w:tc>
-        <w:tc>
-          <w:tcPr>
-            <w:tcW w:type="dxa" w:w="1440"/>
-          </w:tcPr>
-          <w:p>
-            <w:r/>
-            <w:r>
-              <w:rPr>
-                <w:sz w:val="19"/>
-              </w:rPr>
-              <w:t>0</w:t>
-            </w:r>
-          </w:p>
-        </w:tc>
-        <w:tc>
-          <w:tcPr>
-            <w:tcW w:type="dxa" w:w="1296"/>
-          </w:tcPr>
-          <w:p>
-            <w:r/>
-            <w:r>
-              <w:rPr>
-                <w:sz w:val="19"/>
-              </w:rPr>
-              <w:t>148</w:t>
-            </w:r>
-          </w:p>
-        </w:tc>
-        <w:tc>
-          <w:tcPr>
-            <w:tcW w:type="dxa" w:w="1296"/>
-          </w:tcPr>
-          <w:p>
-            <w:r/>
-            <w:r>
-              <w:rPr>
-                <w:sz w:val="19"/>
-              </w:rPr>
-              <w:t>600</w:t>
-            </w:r>
-          </w:p>
-        </w:tc>
-        <w:tc>
-          <w:tcPr>
-            <w:tcW w:type="dxa" w:w="1296"/>
-          </w:tcPr>
-          <w:p>
-            <w:r/>
-            <w:r>
-              <w:rPr>
-                <w:sz w:val="19"/>
-              </w:rPr>
-              <w:t>900</w:t>
-            </w:r>
-          </w:p>
-        </w:tc>
-        <w:tc>
-          <w:tcPr>
-            <w:tcW w:type="dxa" w:w="1296"/>
-          </w:tcPr>
-          <w:p>
-            <w:r/>
-            <w:r>
-              <w:rPr>
-                <w:sz w:val="19"/>
-              </w:rPr>
-              <w:t>1,200</w:t>
-            </w:r>
-          </w:p>
-        </w:tc>
-      </w:tr>
-      <w:tr>
-        <w:tc>
-          <w:tcPr>
-            <w:tcW w:type="dxa" w:w="2304"/>
-          </w:tcPr>
-          <w:p>
-            <w:r/>
-            <w:r>
-              <w:rPr>
-                <w:sz w:val="19"/>
-              </w:rPr>
-              <w:t>Revenue</w:t>
-            </w:r>
-          </w:p>
-        </w:tc>
-        <w:tc>
-          <w:tcPr>
-            <w:tcW w:type="dxa" w:w="1440"/>
-          </w:tcPr>
-          <w:p>
-            <w:r/>
-            <w:r>
-              <w:rPr>
-                <w:sz w:val="19"/>
-              </w:rPr>
-              <w:t>0</w:t>
-            </w:r>
-          </w:p>
-        </w:tc>
-        <w:tc>
-          <w:tcPr>
-            <w:tcW w:type="dxa" w:w="1296"/>
-          </w:tcPr>
-          <w:p>
-            <w:r/>
-            <w:r>
-              <w:rPr>
-                <w:sz w:val="19"/>
-              </w:rPr>
-              <w:t>4,810</w:t>
-            </w:r>
-          </w:p>
-        </w:tc>
-        <w:tc>
-          <w:tcPr>
-            <w:tcW w:type="dxa" w:w="1296"/>
-          </w:tcPr>
-          <w:p>
-            <w:r/>
-            <w:r>
-              <w:rPr>
-                <w:sz w:val="19"/>
-              </w:rPr>
-              <w:t>19,500</w:t>
-            </w:r>
-          </w:p>
-        </w:tc>
-        <w:tc>
-          <w:tcPr>
-            <w:tcW w:type="dxa" w:w="1296"/>
-          </w:tcPr>
-          <w:p>
-            <w:r/>
-            <w:r>
-              <w:rPr>
-                <w:sz w:val="19"/>
-              </w:rPr>
-              <w:t>29,250</w:t>
-            </w:r>
-          </w:p>
-        </w:tc>
-        <w:tc>
-          <w:tcPr>
-            <w:tcW w:type="dxa" w:w="1296"/>
-          </w:tcPr>
-          <w:p>
-            <w:r/>
-            <w:r>
-              <w:rPr>
-                <w:sz w:val="19"/>
-              </w:rPr>
-              <w:t>39,000</w:t>
-            </w:r>
-          </w:p>
-        </w:tc>
-      </w:tr>
-      <w:tr>
-        <w:tc>
-          <w:tcPr>
-            <w:tcW w:type="dxa" w:w="2304"/>
-          </w:tcPr>
-          <w:p>
-            <w:r/>
-            <w:r>
-              <w:rPr>
-                <w:sz w:val="19"/>
-              </w:rPr>
-              <w:t>COGS</w:t>
-            </w:r>
-          </w:p>
-        </w:tc>
-        <w:tc>
-          <w:tcPr>
-            <w:tcW w:type="dxa" w:w="1440"/>
-          </w:tcPr>
-          <w:p>
-            <w:r/>
-            <w:r>
-              <w:rPr>
-                <w:sz w:val="19"/>
-              </w:rPr>
-              <w:t>0</w:t>
-            </w:r>
-          </w:p>
-        </w:tc>
-        <w:tc>
-          <w:tcPr>
-            <w:tcW w:type="dxa" w:w="1296"/>
-          </w:tcPr>
-          <w:p>
-            <w:r/>
-            <w:r>
-              <w:rPr>
-                <w:sz w:val="19"/>
-              </w:rPr>
-              <w:t>1,628</w:t>
-            </w:r>
-          </w:p>
-        </w:tc>
-        <w:tc>
-          <w:tcPr>
-            <w:tcW w:type="dxa" w:w="1296"/>
-          </w:tcPr>
-          <w:p>
-            <w:r/>
-            <w:r>
-              <w:rPr>
-                <w:sz w:val="19"/>
-              </w:rPr>
-              <w:t>6,600</w:t>
-            </w:r>
-          </w:p>
-        </w:tc>
-        <w:tc>
-          <w:tcPr>
-            <w:tcW w:type="dxa" w:w="1296"/>
-          </w:tcPr>
-          <w:p>
-            <w:r/>
-            <w:r>
-              <w:rPr>
-                <w:sz w:val="19"/>
-              </w:rPr>
-              <w:t>9,900</w:t>
-            </w:r>
-          </w:p>
-        </w:tc>
-        <w:tc>
-          <w:tcPr>
-            <w:tcW w:type="dxa" w:w="1296"/>
-          </w:tcPr>
-          <w:p>
-            <w:r/>
-            <w:r>
-              <w:rPr>
-                <w:sz w:val="19"/>
-              </w:rPr>
-              <w:t>13,200</w:t>
-            </w:r>
-          </w:p>
-        </w:tc>
-      </w:tr>
-      <w:tr>
-        <w:tc>
-          <w:tcPr>
-            <w:tcW w:type="dxa" w:w="2304"/>
-          </w:tcPr>
-          <w:p>
-            <w:r/>
-            <w:r>
-              <w:rPr>
-                <w:sz w:val="19"/>
-              </w:rPr>
-              <w:t>Gross profit</w:t>
-            </w:r>
-          </w:p>
-        </w:tc>
-        <w:tc>
-          <w:tcPr>
-            <w:tcW w:type="dxa" w:w="1440"/>
-          </w:tcPr>
-          <w:p>
-            <w:r/>
-            <w:r>
-              <w:rPr>
-                <w:sz w:val="19"/>
-              </w:rPr>
-              <w:t>0</w:t>
-            </w:r>
-          </w:p>
-        </w:tc>
-        <w:tc>
-          <w:tcPr>
-            <w:tcW w:type="dxa" w:w="1296"/>
-          </w:tcPr>
-          <w:p>
-            <w:r/>
-            <w:r>
-              <w:rPr>
-                <w:sz w:val="19"/>
-              </w:rPr>
-              <w:t>3,182</w:t>
-            </w:r>
-          </w:p>
-        </w:tc>
-        <w:tc>
-          <w:tcPr>
-            <w:tcW w:type="dxa" w:w="1296"/>
-          </w:tcPr>
-          <w:p>
-            <w:r/>
-            <w:r>
-              <w:rPr>
-                <w:sz w:val="19"/>
-              </w:rPr>
-              <w:t>12,900</w:t>
-            </w:r>
-          </w:p>
-        </w:tc>
-        <w:tc>
-          <w:tcPr>
-            <w:tcW w:type="dxa" w:w="1296"/>
-          </w:tcPr>
-          <w:p>
-            <w:r/>
-            <w:r>
-              <w:rPr>
-                <w:sz w:val="19"/>
-              </w:rPr>
-              <w:t>19,350</w:t>
-            </w:r>
-          </w:p>
-        </w:tc>
-        <w:tc>
-          <w:tcPr>
-            <w:tcW w:type="dxa" w:w="1296"/>
-          </w:tcPr>
-          <w:p>
-            <w:r/>
-            <w:r>
-              <w:rPr>
-                <w:sz w:val="19"/>
-              </w:rPr>
-              <w:t>25,800</w:t>
-            </w:r>
-          </w:p>
-        </w:tc>
-      </w:tr>
-      <w:tr>
-        <w:tc>
-          <w:tcPr>
-            <w:tcW w:type="dxa" w:w="2304"/>
-          </w:tcPr>
-          <w:p>
-            <w:r/>
-            <w:r>
-              <w:rPr>
-                <w:sz w:val="19"/>
-              </w:rPr>
-              <w:t>Gross margin</w:t>
-            </w:r>
-          </w:p>
-        </w:tc>
-        <w:tc>
-          <w:tcPr>
-            <w:tcW w:type="dxa" w:w="1440"/>
-          </w:tcPr>
-          <w:p>
-            <w:r/>
-            <w:r>
-              <w:rPr>
-                <w:sz w:val="19"/>
-              </w:rPr>
-              <w:t>—</w:t>
-            </w:r>
-          </w:p>
-        </w:tc>
-        <w:tc>
-          <w:tcPr>
-            <w:tcW w:type="dxa" w:w="1296"/>
-          </w:tcPr>
-          <w:p>
-            <w:r/>
-            <w:r>
-              <w:rPr>
-                <w:sz w:val="19"/>
-              </w:rPr>
-              <w:t>66.2%</w:t>
-            </w:r>
-          </w:p>
-        </w:tc>
-        <w:tc>
-          <w:tcPr>
-            <w:tcW w:type="dxa" w:w="1296"/>
-          </w:tcPr>
-          <w:p>
-            <w:r/>
-            <w:r>
-              <w:rPr>
-                <w:sz w:val="19"/>
-              </w:rPr>
-              <w:t>66.2%</w:t>
-            </w:r>
-          </w:p>
-        </w:tc>
-        <w:tc>
-          <w:tcPr>
-            <w:tcW w:type="dxa" w:w="1296"/>
-          </w:tcPr>
-          <w:p>
-            <w:r/>
-            <w:r>
-              <w:rPr>
-                <w:sz w:val="19"/>
-              </w:rPr>
-              <w:t>66.2%</w:t>
-            </w:r>
-          </w:p>
-        </w:tc>
-        <w:tc>
-          <w:tcPr>
-            <w:tcW w:type="dxa" w:w="1296"/>
-          </w:tcPr>
-          <w:p>
-            <w:r/>
-            <w:r>
-              <w:rPr>
-                <w:sz w:val="19"/>
-              </w:rPr>
-              <w:t>66.2%</w:t>
-            </w:r>
-          </w:p>
-        </w:tc>
-      </w:tr>
-      <w:tr>
-        <w:tc>
-          <w:tcPr>
-            <w:tcW w:type="dxa" w:w="2304"/>
-          </w:tcPr>
-          <w:p>
-            <w:r/>
-            <w:r>
-              <w:rPr>
-                <w:sz w:val="19"/>
-              </w:rPr>
-              <w:t>OpEx (assumption)</w:t>
-            </w:r>
-          </w:p>
-        </w:tc>
-        <w:tc>
-          <w:tcPr>
-            <w:tcW w:type="dxa" w:w="1440"/>
-          </w:tcPr>
-          <w:p>
-            <w:r/>
-            <w:r>
-              <w:rPr>
-                <w:sz w:val="19"/>
-              </w:rPr>
-              <w:t>700</w:t>
-            </w:r>
-          </w:p>
-        </w:tc>
-        <w:tc>
-          <w:tcPr>
-            <w:tcW w:type="dxa" w:w="1296"/>
-          </w:tcPr>
-          <w:p>
-            <w:r/>
-            <w:r>
-              <w:rPr>
-                <w:sz w:val="19"/>
-              </w:rPr>
-              <w:t>2,400</w:t>
-            </w:r>
-          </w:p>
-        </w:tc>
-        <w:tc>
-          <w:tcPr>
-            <w:tcW w:type="dxa" w:w="1296"/>
-          </w:tcPr>
-          <w:p>
-            <w:r/>
-            <w:r>
-              <w:rPr>
-                <w:sz w:val="19"/>
-              </w:rPr>
-              <w:t>5,800</w:t>
-            </w:r>
-          </w:p>
-        </w:tc>
-        <w:tc>
-          <w:tcPr>
-            <w:tcW w:type="dxa" w:w="1296"/>
-          </w:tcPr>
-          <w:p>
-            <w:r/>
-            <w:r>
-              <w:rPr>
-                <w:sz w:val="19"/>
-              </w:rPr>
-              <w:t>8,000</w:t>
-            </w:r>
-          </w:p>
-        </w:tc>
-        <w:tc>
-          <w:tcPr>
-            <w:tcW w:type="dxa" w:w="1296"/>
-          </w:tcPr>
-          <w:p>
-            <w:r/>
-            <w:r>
-              <w:rPr>
-                <w:sz w:val="19"/>
-              </w:rPr>
-              <w:t>9,800</w:t>
-            </w:r>
-          </w:p>
-        </w:tc>
-      </w:tr>
-      <w:tr>
-        <w:tc>
-          <w:tcPr>
-            <w:tcW w:type="dxa" w:w="2304"/>
-          </w:tcPr>
-          <w:p>
-            <w:r/>
-            <w:r>
-              <w:rPr>
-                <w:sz w:val="19"/>
-              </w:rPr>
-              <w:t>EBITDA</w:t>
-            </w:r>
-          </w:p>
-        </w:tc>
-        <w:tc>
-          <w:tcPr>
-            <w:tcW w:type="dxa" w:w="1440"/>
-          </w:tcPr>
-          <w:p>
-            <w:r/>
-            <w:r>
-              <w:rPr>
-                <w:sz w:val="19"/>
-              </w:rPr>
-              <w:t>(700)</w:t>
-            </w:r>
-          </w:p>
-        </w:tc>
-        <w:tc>
-          <w:tcPr>
-            <w:tcW w:type="dxa" w:w="1296"/>
-          </w:tcPr>
-          <w:p>
-            <w:r/>
-            <w:r>
-              <w:rPr>
-                <w:sz w:val="19"/>
-              </w:rPr>
-              <w:t>782</w:t>
-            </w:r>
-          </w:p>
-        </w:tc>
-        <w:tc>
-          <w:tcPr>
-            <w:tcW w:type="dxa" w:w="1296"/>
-          </w:tcPr>
-          <w:p>
-            <w:r/>
-            <w:r>
-              <w:rPr>
-                <w:sz w:val="19"/>
-              </w:rPr>
-              <w:t>7,100</w:t>
-            </w:r>
-          </w:p>
-        </w:tc>
-        <w:tc>
-          <w:tcPr>
-            <w:tcW w:type="dxa" w:w="1296"/>
-          </w:tcPr>
-          <w:p>
-            <w:r/>
-            <w:r>
-              <w:rPr>
-                <w:sz w:val="19"/>
-              </w:rPr>
-              <w:t>11,350</w:t>
-            </w:r>
-          </w:p>
-        </w:tc>
-        <w:tc>
-          <w:tcPr>
-            <w:tcW w:type="dxa" w:w="1296"/>
-          </w:tcPr>
-          <w:p>
-            <w:r/>
-            <w:r>
-              <w:rPr>
-                <w:sz w:val="19"/>
-              </w:rPr>
-              <w:t>16,000</w:t>
-            </w:r>
-          </w:p>
-        </w:tc>
-      </w:tr>
-      <w:tr>
-        <w:tc>
-          <w:tcPr>
-            <w:tcW w:type="dxa" w:w="2304"/>
-          </w:tcPr>
-          <w:p>
-            <w:r/>
-            <w:r>
-              <w:rPr>
-                <w:sz w:val="19"/>
-              </w:rPr>
-              <w:t>EBITDA margin</w:t>
-            </w:r>
-          </w:p>
-        </w:tc>
-        <w:tc>
-          <w:tcPr>
-            <w:tcW w:type="dxa" w:w="1440"/>
-          </w:tcPr>
-          <w:p>
-            <w:r/>
-            <w:r>
-              <w:rPr>
-                <w:sz w:val="19"/>
-              </w:rPr>
-              <w:t>—</w:t>
-            </w:r>
-          </w:p>
-        </w:tc>
-        <w:tc>
-          <w:tcPr>
-            <w:tcW w:type="dxa" w:w="1296"/>
-          </w:tcPr>
-          <w:p>
-            <w:r/>
-            <w:r>
-              <w:rPr>
-                <w:sz w:val="19"/>
-              </w:rPr>
-              <w:t>16.3%</w:t>
-            </w:r>
-          </w:p>
-        </w:tc>
-        <w:tc>
-          <w:tcPr>
-            <w:tcW w:type="dxa" w:w="1296"/>
-          </w:tcPr>
-          <w:p>
-            <w:r/>
-            <w:r>
-              <w:rPr>
-                <w:sz w:val="19"/>
-              </w:rPr>
-              <w:t>36.4%</w:t>
-            </w:r>
-          </w:p>
-        </w:tc>
-        <w:tc>
-          <w:tcPr>
-            <w:tcW w:type="dxa" w:w="1296"/>
-          </w:tcPr>
-          <w:p>
-            <w:r/>
-            <w:r>
-              <w:rPr>
-                <w:sz w:val="19"/>
-              </w:rPr>
-              <w:t>38.8%</w:t>
-            </w:r>
-          </w:p>
-        </w:tc>
-        <w:tc>
-          <w:tcPr>
-            <w:tcW w:type="dxa" w:w="1296"/>
-          </w:tcPr>
-          <w:p>
-            <w:r/>
-            <w:r>
-              <w:rPr>
-                <w:sz w:val="19"/>
-              </w:rPr>
-              <w:t>41.0%</w:t>
-            </w:r>
-          </w:p>
-        </w:tc>
-      </w:tr>
-    </w:tbl>
-    <w:p>
-      <w:pPr>
-        <w:spacing w:after="40"/>
-      </w:pPr>
-    </w:p>
-    <w:p>
-      <w:pPr>
-        <w:pStyle w:val="Heading2"/>
-      </w:pPr>
-      <w:r>
-        <w:t>6.3 Scenarios (full-year 2029)</w:t>
-      </w:r>
-    </w:p>
-    <w:tbl>
-      <w:tblPr>
-        <w:tblStyle w:val="LightGrid-Accent1"/>
-        <w:tblW w:type="auto" w:w="0"/>
-        <w:jc w:val="center"/>
-        <w:tblLook w:firstColumn="1" w:firstRow="1" w:lastColumn="0" w:lastRow="0" w:noHBand="0" w:noVBand="1" w:val="04A0"/>
-      </w:tblPr>
-      <w:tblGrid>
-        <w:gridCol w:w="1234"/>
-        <w:gridCol w:w="1234"/>
-        <w:gridCol w:w="1234"/>
-        <w:gridCol w:w="1234"/>
-        <w:gridCol w:w="1234"/>
-        <w:gridCol w:w="1234"/>
-        <w:gridCol w:w="1234"/>
-      </w:tblGrid>
-      <w:tr>
-        <w:tc>
-          <w:tcPr>
-            <w:tcW w:type="dxa" w:w="1584"/>
-          </w:tcPr>
-          <w:p>
-            <w:r/>
-            <w:r>
-              <w:rPr>
-                <w:b/>
-                <w:sz w:val="19"/>
-              </w:rPr>
-              <w:t>Scenario</w:t>
-            </w:r>
-          </w:p>
-        </w:tc>
-        <w:tc>
-          <w:tcPr>
-            <w:tcW w:type="dxa" w:w="1008"/>
-          </w:tcPr>
-          <w:p>
-            <w:r/>
-            <w:r>
-              <w:rPr>
-                <w:b/>
-                <w:sz w:val="19"/>
-              </w:rPr>
-              <w:t>EXW</w:t>
-            </w:r>
-          </w:p>
-        </w:tc>
-        <w:tc>
-          <w:tcPr>
-            <w:tcW w:type="dxa" w:w="1152"/>
-          </w:tcPr>
-          <w:p>
-            <w:r/>
-            <w:r>
-              <w:rPr>
-                <w:b/>
-                <w:sz w:val="19"/>
-              </w:rPr>
-              <w:t>Material</w:t>
-            </w:r>
-          </w:p>
-        </w:tc>
-        <w:tc>
-          <w:tcPr>
-            <w:tcW w:type="dxa" w:w="1440"/>
-          </w:tcPr>
-          <w:p>
-            <w:r/>
-            <w:r>
-              <w:rPr>
-                <w:b/>
-                <w:sz w:val="19"/>
-              </w:rPr>
-              <w:t>Vials/yr</w:t>
-            </w:r>
-          </w:p>
-        </w:tc>
-        <w:tc>
-          <w:tcPr>
-            <w:tcW w:type="dxa" w:w="1296"/>
-          </w:tcPr>
-          <w:p>
-            <w:r/>
-            <w:r>
-              <w:rPr>
-                <w:b/>
-                <w:sz w:val="19"/>
-              </w:rPr>
-              <w:t>Revenue</w:t>
-            </w:r>
-          </w:p>
-        </w:tc>
-        <w:tc>
-          <w:tcPr>
-            <w:tcW w:type="dxa" w:w="1296"/>
-          </w:tcPr>
-          <w:p>
-            <w:r/>
-            <w:r>
-              <w:rPr>
-                <w:b/>
-                <w:sz w:val="19"/>
-              </w:rPr>
-              <w:t>GP</w:t>
-            </w:r>
-          </w:p>
-        </w:tc>
-        <w:tc>
-          <w:tcPr>
-            <w:tcW w:type="dxa" w:w="1008"/>
-          </w:tcPr>
-          <w:p>
-            <w:r/>
-            <w:r>
-              <w:rPr>
-                <w:b/>
-                <w:sz w:val="19"/>
-              </w:rPr>
-              <w:t>GM%</w:t>
-            </w:r>
-          </w:p>
-        </w:tc>
-      </w:tr>
-      <w:tr>
-        <w:tc>
-          <w:tcPr>
-            <w:tcW w:type="dxa" w:w="1584"/>
-          </w:tcPr>
-          <w:p>
-            <w:r/>
-            <w:r>
-              <w:rPr>
-                <w:sz w:val="19"/>
-              </w:rPr>
-              <w:t>Conservative</w:t>
-            </w:r>
-          </w:p>
-        </w:tc>
-        <w:tc>
-          <w:tcPr>
-            <w:tcW w:type="dxa" w:w="1008"/>
-          </w:tcPr>
-          <w:p>
-            <w:r/>
-            <w:r>
-              <w:rPr>
-                <w:sz w:val="19"/>
-              </w:rPr>
-              <w:t>$30</w:t>
-            </w:r>
-          </w:p>
-        </w:tc>
-        <w:tc>
-          <w:tcPr>
-            <w:tcW w:type="dxa" w:w="1152"/>
-          </w:tcPr>
-          <w:p>
-            <w:r/>
-            <w:r>
-              <w:rPr>
-                <w:sz w:val="19"/>
-              </w:rPr>
-              <w:t>$5</w:t>
-            </w:r>
-          </w:p>
-        </w:tc>
-        <w:tc>
-          <w:tcPr>
-            <w:tcW w:type="dxa" w:w="1440"/>
-          </w:tcPr>
-          <w:p>
-            <w:r/>
-            <w:r>
-              <w:rPr>
-                <w:sz w:val="19"/>
-              </w:rPr>
-              <w:t>720,000</w:t>
-            </w:r>
-          </w:p>
-        </w:tc>
-        <w:tc>
-          <w:tcPr>
-            <w:tcW w:type="dxa" w:w="1296"/>
-          </w:tcPr>
-          <w:p>
-            <w:r/>
-            <w:r>
-              <w:rPr>
-                <w:sz w:val="19"/>
-              </w:rPr>
-              <w:t>$21.6M</w:t>
-            </w:r>
-          </w:p>
-        </w:tc>
-        <w:tc>
-          <w:tcPr>
-            <w:tcW w:type="dxa" w:w="1296"/>
-          </w:tcPr>
-          <w:p>
-            <w:r/>
-            <w:r>
-              <w:rPr>
-                <w:sz w:val="19"/>
-              </w:rPr>
-              <w:t>$14.0M</w:t>
-            </w:r>
-          </w:p>
-        </w:tc>
-        <w:tc>
-          <w:tcPr>
-            <w:tcW w:type="dxa" w:w="1008"/>
-          </w:tcPr>
-          <w:p>
-            <w:r/>
-            <w:r>
-              <w:rPr>
-                <w:sz w:val="19"/>
-              </w:rPr>
-              <w:t>65.0%</w:t>
-            </w:r>
-          </w:p>
-        </w:tc>
-      </w:tr>
-      <w:tr>
-        <w:tc>
-          <w:tcPr>
-            <w:tcW w:type="dxa" w:w="1584"/>
-          </w:tcPr>
-          <w:p>
-            <w:r/>
-            <w:r>
-              <w:rPr>
-                <w:sz w:val="19"/>
-              </w:rPr>
-              <w:t>Base</w:t>
-            </w:r>
-          </w:p>
-        </w:tc>
-        <w:tc>
-          <w:tcPr>
-            <w:tcW w:type="dxa" w:w="1008"/>
-          </w:tcPr>
-          <w:p>
-            <w:r/>
-            <w:r>
-              <w:rPr>
-                <w:sz w:val="19"/>
-              </w:rPr>
-              <w:t>$32.50</w:t>
-            </w:r>
-          </w:p>
-        </w:tc>
-        <w:tc>
-          <w:tcPr>
-            <w:tcW w:type="dxa" w:w="1152"/>
-          </w:tcPr>
-          <w:p>
-            <w:r/>
-            <w:r>
-              <w:rPr>
-                <w:sz w:val="19"/>
-              </w:rPr>
-              <w:t>$4.50</w:t>
-            </w:r>
-          </w:p>
-        </w:tc>
-        <w:tc>
-          <w:tcPr>
-            <w:tcW w:type="dxa" w:w="1440"/>
-          </w:tcPr>
-          <w:p>
-            <w:r/>
-            <w:r>
-              <w:rPr>
-                <w:sz w:val="19"/>
-              </w:rPr>
-              <w:t>900,000</w:t>
-            </w:r>
-          </w:p>
-        </w:tc>
-        <w:tc>
-          <w:tcPr>
-            <w:tcW w:type="dxa" w:w="1296"/>
-          </w:tcPr>
-          <w:p>
-            <w:r/>
-            <w:r>
-              <w:rPr>
-                <w:sz w:val="19"/>
-              </w:rPr>
-              <w:t>$29.25M</w:t>
-            </w:r>
-          </w:p>
-        </w:tc>
-        <w:tc>
-          <w:tcPr>
-            <w:tcW w:type="dxa" w:w="1296"/>
-          </w:tcPr>
-          <w:p>
-            <w:r/>
-            <w:r>
-              <w:rPr>
-                <w:sz w:val="19"/>
-              </w:rPr>
-              <w:t>$19.35M</w:t>
-            </w:r>
-          </w:p>
-        </w:tc>
-        <w:tc>
-          <w:tcPr>
-            <w:tcW w:type="dxa" w:w="1008"/>
-          </w:tcPr>
-          <w:p>
-            <w:r/>
-            <w:r>
-              <w:rPr>
-                <w:sz w:val="19"/>
-              </w:rPr>
-              <w:t>66.2%</w:t>
-            </w:r>
-          </w:p>
-        </w:tc>
-      </w:tr>
-      <w:tr>
-        <w:tc>
-          <w:tcPr>
-            <w:tcW w:type="dxa" w:w="1584"/>
-          </w:tcPr>
-          <w:p>
-            <w:r/>
-            <w:r>
-              <w:rPr>
-                <w:sz w:val="19"/>
-              </w:rPr>
-              <w:t>Upside</w:t>
-            </w:r>
-          </w:p>
-        </w:tc>
-        <w:tc>
-          <w:tcPr>
-            <w:tcW w:type="dxa" w:w="1008"/>
-          </w:tcPr>
-          <w:p>
-            <w:r/>
-            <w:r>
-              <w:rPr>
-                <w:sz w:val="19"/>
-              </w:rPr>
-              <w:t>$35</w:t>
-            </w:r>
-          </w:p>
-        </w:tc>
-        <w:tc>
-          <w:tcPr>
-            <w:tcW w:type="dxa" w:w="1152"/>
-          </w:tcPr>
-          <w:p>
-            <w:r/>
-            <w:r>
-              <w:rPr>
-                <w:sz w:val="19"/>
-              </w:rPr>
-              <w:t>$3</w:t>
-            </w:r>
-          </w:p>
-        </w:tc>
-        <w:tc>
-          <w:tcPr>
-            <w:tcW w:type="dxa" w:w="1440"/>
-          </w:tcPr>
-          <w:p>
-            <w:r/>
-            <w:r>
-              <w:rPr>
-                <w:sz w:val="19"/>
-              </w:rPr>
-              <w:t>1,080,000</w:t>
-            </w:r>
-          </w:p>
-        </w:tc>
-        <w:tc>
-          <w:tcPr>
-            <w:tcW w:type="dxa" w:w="1296"/>
-          </w:tcPr>
-          <w:p>
-            <w:r/>
-            <w:r>
-              <w:rPr>
-                <w:sz w:val="19"/>
-              </w:rPr>
-              <w:t>$37.8M</w:t>
-            </w:r>
-          </w:p>
-        </w:tc>
-        <w:tc>
-          <w:tcPr>
-            <w:tcW w:type="dxa" w:w="1296"/>
-          </w:tcPr>
-          <w:p>
-            <w:r/>
-            <w:r>
-              <w:rPr>
-                <w:sz w:val="19"/>
-              </w:rPr>
-              <w:t>$25.4M</w:t>
-            </w:r>
-          </w:p>
-        </w:tc>
-        <w:tc>
-          <w:tcPr>
-            <w:tcW w:type="dxa" w:w="1008"/>
-          </w:tcPr>
-          <w:p>
-            <w:r/>
-            <w:r>
-              <w:rPr>
-                <w:sz w:val="19"/>
-              </w:rPr>
-              <w:t>67.1%</w:t>
-            </w:r>
-          </w:p>
-        </w:tc>
-      </w:tr>
-    </w:tbl>
-    <w:p>
-      <w:pPr>
-        <w:spacing w:after="40"/>
-      </w:pPr>
-    </w:p>
-    <w:p>
-      <w:pPr>
-        <w:spacing w:after="120"/>
-      </w:pPr>
-      <w:r>
-        <w:rPr>
-          <w:b w:val="0"/>
-          <w:i/>
-          <w:sz w:val="19"/>
-        </w:rPr>
-        <w:t>The confirmed sub-$5 material cost means even the conservative scenario clears 65% gross margin — downside is driven by volume/ramp, not unit economics.</w:t>
-      </w:r>
-    </w:p>
-    <w:p>
-      <w:pPr>
-        <w:pStyle w:val="Heading1"/>
-      </w:pPr>
-      <w:r>
-        <w:t>7. Valuation</w:t>
+        <w:t>Lens B — AI / data-science company (the prize; attracts institutional AI capital).</w:t>
       </w:r>
     </w:p>
     <w:p>
@@ -2757,48 +2248,7 @@
           <w:i w:val="0"/>
           <w:sz w:val="21"/>
         </w:rPr>
-        <w:t>Synapep is a pre-revenue JV that owns/co-owns the Synexo platform, raising $1.0M to kick off. It is valued standalone at the ex-factory line.</w:t>
-      </w:r>
-    </w:p>
-    <w:p>
-      <w:pPr>
-        <w:spacing w:after="40"/>
-      </w:pPr>
-      <w:r>
-        <w:rPr>
-          <w:b/>
-          <w:i w:val="0"/>
-          <w:sz w:val="21"/>
-        </w:rPr>
-        <w:t>Two numbers:</w:t>
-      </w:r>
-    </w:p>
-    <w:p>
-      <w:pPr>
-        <w:pStyle w:val="ListBullet"/>
-      </w:pPr>
-      <w:r>
-        <w:rPr>
-          <w:b/>
-        </w:rPr>
-        <w:t>Price this round at —</w:t>
-      </w:r>
-      <w:r>
-        <w:t xml:space="preserve"> $5–7M pre-money / $6–8M post-money — $1.0M buys ~13–17%. Stepped up from a bare-licence shell because, as a JV, Synapep holds the IP (patents filed), runs in-house manufacturing (Eyesel), earns ~66% margins, and has Feb-2027 revenue.</w:t>
-      </w:r>
-    </w:p>
-    <w:p>
-      <w:pPr>
-        <w:pStyle w:val="ListBullet"/>
-      </w:pPr>
-      <w:r>
-        <w:rPr>
-          <w:b/>
-        </w:rPr>
-        <w:t>The prize if it executes —</w:t>
-      </w:r>
-      <w:r>
-        <w:t xml:space="preserve"> a risk-unadjusted enterprise value of ~$30–40M by 2030–31 on the base case, plus platform-licensing optionality. Upside story, not today's price.</w:t>
+        <w:t>With a proprietary model, an AI-QA/analytics suite, and a compounding data flywheel, the comparables shift from medtech to AI/data platforms — much higher multiples. This does not change the $1M kickoff price (priced on Lens A) but raises the valuation ceiling and reframes the 2028 Series A as a premium, institutional AI round.</w:t>
       </w:r>
     </w:p>
     <w:p>
@@ -2806,283 +2256,7 @@
         <w:pStyle w:val="Heading2"/>
       </w:pPr>
       <w:r>
-        <w:t>7.1 Three methods (they reconcile)</w:t>
-      </w:r>
-    </w:p>
-    <w:tbl>
-      <w:tblPr>
-        <w:tblStyle w:val="LightGrid-Accent1"/>
-        <w:tblW w:type="auto" w:w="0"/>
-        <w:jc w:val="center"/>
-        <w:tblLook w:firstColumn="1" w:firstRow="1" w:lastColumn="0" w:lastRow="0" w:noHBand="0" w:noVBand="1" w:val="04A0"/>
-      </w:tblPr>
-      <w:tblGrid>
-        <w:gridCol w:w="2160"/>
-        <w:gridCol w:w="2160"/>
-        <w:gridCol w:w="2160"/>
-        <w:gridCol w:w="2160"/>
-      </w:tblGrid>
-      <w:tr>
-        <w:tc>
-          <w:tcPr>
-            <w:tcW w:type="dxa" w:w="3456"/>
-          </w:tcPr>
-          <w:p>
-            <w:r/>
-            <w:r>
-              <w:rPr>
-                <w:b/>
-                <w:sz w:val="19"/>
-              </w:rPr>
-              <w:t>Method</w:t>
-            </w:r>
-          </w:p>
-        </w:tc>
-        <w:tc>
-          <w:tcPr>
-            <w:tcW w:type="dxa" w:w="2160"/>
-          </w:tcPr>
-          <w:p>
-            <w:r/>
-            <w:r>
-              <w:rPr>
-                <w:b/>
-                <w:sz w:val="19"/>
-              </w:rPr>
-              <w:t>Un-risk-adjusted</w:t>
-            </w:r>
-          </w:p>
-        </w:tc>
-        <w:tc>
-          <w:tcPr>
-            <w:tcW w:type="dxa" w:w="2304"/>
-          </w:tcPr>
-          <w:p>
-            <w:r/>
-            <w:r>
-              <w:rPr>
-                <w:b/>
-                <w:sz w:val="19"/>
-              </w:rPr>
-              <w:t>Risk-adjusted (JV, ~20%)</w:t>
-            </w:r>
-          </w:p>
-        </w:tc>
-        <w:tc>
-          <w:tcPr>
-            <w:tcW w:type="dxa" w:w="1440"/>
-          </w:tcPr>
-          <w:p>
-            <w:r/>
-            <w:r>
-              <w:rPr>
-                <w:b/>
-                <w:sz w:val="19"/>
-              </w:rPr>
-              <w:t>Today's round</w:t>
-            </w:r>
-          </w:p>
-        </w:tc>
-      </w:tr>
-      <w:tr>
-        <w:tc>
-          <w:tcPr>
-            <w:tcW w:type="dxa" w:w="3456"/>
-          </w:tcPr>
-          <w:p>
-            <w:r/>
-            <w:r>
-              <w:rPr>
-                <w:sz w:val="19"/>
-              </w:rPr>
-              <w:t>Seed convention (owns IP)</w:t>
-            </w:r>
-          </w:p>
-        </w:tc>
-        <w:tc>
-          <w:tcPr>
-            <w:tcW w:type="dxa" w:w="2160"/>
-          </w:tcPr>
-          <w:p>
-            <w:r/>
-            <w:r>
-              <w:rPr>
-                <w:sz w:val="19"/>
-              </w:rPr>
-              <w:t>—</w:t>
-            </w:r>
-          </w:p>
-        </w:tc>
-        <w:tc>
-          <w:tcPr>
-            <w:tcW w:type="dxa" w:w="2304"/>
-          </w:tcPr>
-          <w:p>
-            <w:r/>
-            <w:r>
-              <w:rPr>
-                <w:sz w:val="19"/>
-              </w:rPr>
-              <w:t>$5–7M</w:t>
-            </w:r>
-          </w:p>
-        </w:tc>
-        <w:tc>
-          <w:tcPr>
-            <w:tcW w:type="dxa" w:w="1440"/>
-          </w:tcPr>
-          <w:p>
-            <w:r/>
-            <w:r>
-              <w:rPr>
-                <w:sz w:val="19"/>
-              </w:rPr>
-              <w:t>direct</w:t>
-            </w:r>
-          </w:p>
-        </w:tc>
-      </w:tr>
-      <w:tr>
-        <w:tc>
-          <w:tcPr>
-            <w:tcW w:type="dxa" w:w="3456"/>
-          </w:tcPr>
-          <w:p>
-            <w:r/>
-            <w:r>
-              <w:rPr>
-                <w:sz w:val="19"/>
-              </w:rPr>
-              <w:t>DCF (40% discount, 8× EBITDA exit)</w:t>
-            </w:r>
-          </w:p>
-        </w:tc>
-        <w:tc>
-          <w:tcPr>
-            <w:tcW w:type="dxa" w:w="2160"/>
-          </w:tcPr>
-          <w:p>
-            <w:r/>
-            <w:r>
-              <w:rPr>
-                <w:sz w:val="19"/>
-              </w:rPr>
-              <w:t>~$35M EV</w:t>
-            </w:r>
-          </w:p>
-        </w:tc>
-        <w:tc>
-          <w:tcPr>
-            <w:tcW w:type="dxa" w:w="2304"/>
-          </w:tcPr>
-          <w:p>
-            <w:r/>
-            <w:r>
-              <w:rPr>
-                <w:sz w:val="19"/>
-              </w:rPr>
-              <w:t>~$6–7M</w:t>
-            </w:r>
-          </w:p>
-        </w:tc>
-        <w:tc>
-          <w:tcPr>
-            <w:tcW w:type="dxa" w:w="1440"/>
-          </w:tcPr>
-          <w:p>
-            <w:r/>
-            <w:r>
-              <w:rPr>
-                <w:sz w:val="19"/>
-              </w:rPr>
-              <w:t>matches</w:t>
-            </w:r>
-          </w:p>
-        </w:tc>
-      </w:tr>
-      <w:tr>
-        <w:tc>
-          <w:tcPr>
-            <w:tcW w:type="dxa" w:w="3456"/>
-          </w:tcPr>
-          <w:p>
-            <w:r/>
-            <w:r>
-              <w:rPr>
-                <w:sz w:val="19"/>
-              </w:rPr>
-              <w:t>Forward revenue/EBITDA multiple</w:t>
-            </w:r>
-          </w:p>
-        </w:tc>
-        <w:tc>
-          <w:tcPr>
-            <w:tcW w:type="dxa" w:w="2160"/>
-          </w:tcPr>
-          <w:p>
-            <w:r/>
-            <w:r>
-              <w:rPr>
-                <w:sz w:val="19"/>
-              </w:rPr>
-              <w:t>$25–37M (PV of EV)</w:t>
-            </w:r>
-          </w:p>
-        </w:tc>
-        <w:tc>
-          <w:tcPr>
-            <w:tcW w:type="dxa" w:w="2304"/>
-          </w:tcPr>
-          <w:p>
-            <w:r/>
-            <w:r>
-              <w:rPr>
-                <w:sz w:val="19"/>
-              </w:rPr>
-              <w:t>$5–8M</w:t>
-            </w:r>
-          </w:p>
-        </w:tc>
-        <w:tc>
-          <w:tcPr>
-            <w:tcW w:type="dxa" w:w="1440"/>
-          </w:tcPr>
-          <w:p>
-            <w:r/>
-            <w:r>
-              <w:rPr>
-                <w:sz w:val="19"/>
-              </w:rPr>
-              <w:t>matches</w:t>
-            </w:r>
-          </w:p>
-        </w:tc>
-      </w:tr>
-    </w:tbl>
-    <w:p>
-      <w:pPr>
-        <w:spacing w:after="40"/>
-      </w:pPr>
-    </w:p>
-    <w:p>
-      <w:pPr>
-        <w:spacing w:after="120"/>
-      </w:pPr>
-      <w:r>
-        <w:rPr>
-          <w:b/>
-          <w:i w:val="0"/>
-          <w:sz w:val="21"/>
-        </w:rPr>
-        <w:t>Recommendation: price the $1.0M kickoff at $5–7M pre-money ($6–8M post), $6M midpoint.</w:t>
-      </w:r>
-    </w:p>
-    <w:p>
-      <w:pPr>
-        <w:pStyle w:val="Heading2"/>
-      </w:pPr>
-      <w:r>
-        <w:t>7.2 Illustrative post-raise cap table (pre-money $6.0M)</w:t>
+        <w:t>7.1 Cap table (post-raise, $6.0M pre-money)</w:t>
       </w:r>
     </w:p>
     <w:tbl>
@@ -3104,7 +2278,6 @@
             <w:tcW w:type="dxa" w:w="2160"/>
           </w:tcPr>
           <w:p>
-            <w:r/>
             <w:r>
               <w:rPr>
                 <w:b/>
@@ -3119,7 +2292,6 @@
             <w:tcW w:type="dxa" w:w="4320"/>
           </w:tcPr>
           <w:p>
-            <w:r/>
             <w:r>
               <w:rPr>
                 <w:b/>
@@ -3134,7 +2306,6 @@
             <w:tcW w:type="dxa" w:w="1440"/>
           </w:tcPr>
           <w:p>
-            <w:r/>
             <w:r>
               <w:rPr>
                 <w:b/>
@@ -3149,7 +2320,6 @@
             <w:tcW w:type="dxa" w:w="1440"/>
           </w:tcPr>
           <w:p>
-            <w:r/>
             <w:r>
               <w:rPr>
                 <w:b/>
@@ -3166,7 +2336,6 @@
             <w:tcW w:type="dxa" w:w="2160"/>
           </w:tcPr>
           <w:p>
-            <w:r/>
             <w:r>
               <w:rPr>
                 <w:sz w:val="19"/>
@@ -3180,12 +2349,11 @@
             <w:tcW w:type="dxa" w:w="4320"/>
           </w:tcPr>
           <w:p>
-            <w:r/>
             <w:r>
               <w:rPr>
                 <w:sz w:val="19"/>
               </w:rPr>
-              <w:t>Synexo IP (IT-EXO/SynExo/CodeLife.AI) + R&amp;D</w:t>
+              <w:t>IP (CodeLife.AI/IT-EXO/SynExo) + R&amp;D</w:t>
             </w:r>
           </w:p>
         </w:tc>
@@ -3194,7 +2362,6 @@
             <w:tcW w:type="dxa" w:w="1440"/>
           </w:tcPr>
           <w:p>
-            <w:r/>
             <w:r>
               <w:rPr>
                 <w:sz w:val="19"/>
@@ -3208,7 +2375,6 @@
             <w:tcW w:type="dxa" w:w="1440"/>
           </w:tcPr>
           <w:p>
-            <w:r/>
             <w:r>
               <w:rPr>
                 <w:sz w:val="19"/>
@@ -3224,7 +2390,6 @@
             <w:tcW w:type="dxa" w:w="2160"/>
           </w:tcPr>
           <w:p>
-            <w:r/>
             <w:r>
               <w:rPr>
                 <w:sz w:val="19"/>
@@ -3238,12 +2403,11 @@
             <w:tcW w:type="dxa" w:w="4320"/>
           </w:tcPr>
           <w:p>
-            <w:r/>
             <w:r>
               <w:rPr>
                 <w:sz w:val="19"/>
               </w:rPr>
-              <w:t>Manufacturing entity (production, fill-finish, QA)</w:t>
+              <w:t>Manufacturing (production, fill-finish, QA)</w:t>
             </w:r>
           </w:p>
         </w:tc>
@@ -3252,7 +2416,6 @@
             <w:tcW w:type="dxa" w:w="1440"/>
           </w:tcPr>
           <w:p>
-            <w:r/>
             <w:r>
               <w:rPr>
                 <w:sz w:val="19"/>
@@ -3266,7 +2429,6 @@
             <w:tcW w:type="dxa" w:w="1440"/>
           </w:tcPr>
           <w:p>
-            <w:r/>
             <w:r>
               <w:rPr>
                 <w:sz w:val="19"/>
@@ -3282,7 +2444,6 @@
             <w:tcW w:type="dxa" w:w="2160"/>
           </w:tcPr>
           <w:p>
-            <w:r/>
             <w:r>
               <w:rPr>
                 <w:sz w:val="19"/>
@@ -3296,7 +2457,6 @@
             <w:tcW w:type="dxa" w:w="4320"/>
           </w:tcPr>
           <w:p>
-            <w:r/>
             <w:r>
               <w:rPr>
                 <w:sz w:val="19"/>
@@ -3310,7 +2470,6 @@
             <w:tcW w:type="dxa" w:w="1440"/>
           </w:tcPr>
           <w:p>
-            <w:r/>
             <w:r>
               <w:rPr>
                 <w:sz w:val="19"/>
@@ -3324,7 +2483,6 @@
             <w:tcW w:type="dxa" w:w="1440"/>
           </w:tcPr>
           <w:p>
-            <w:r/>
             <w:r>
               <w:rPr>
                 <w:sz w:val="19"/>
@@ -3340,7 +2498,6 @@
             <w:tcW w:type="dxa" w:w="2160"/>
           </w:tcPr>
           <w:p>
-            <w:r/>
             <w:r>
               <w:rPr>
                 <w:sz w:val="19"/>
@@ -3354,7 +2511,6 @@
             <w:tcW w:type="dxa" w:w="4320"/>
           </w:tcPr>
           <w:p>
-            <w:r/>
             <w:r>
               <w:rPr>
                 <w:sz w:val="19"/>
@@ -3367,7 +2523,6 @@
             <w:tcW w:type="dxa" w:w="1440"/>
           </w:tcPr>
           <w:p>
-            <w:r/>
             <w:r>
               <w:rPr>
                 <w:sz w:val="19"/>
@@ -3381,7 +2536,6 @@
             <w:tcW w:type="dxa" w:w="1440"/>
           </w:tcPr>
           <w:p>
-            <w:r/>
             <w:r>
               <w:rPr>
                 <w:sz w:val="19"/>
@@ -3407,7 +2561,7 @@
           <w:i/>
           <w:sz w:val="19"/>
         </w:rPr>
-        <w:t>At $6.0M pre / $7.0M post, $1.0M buys 14.3%. NeuNova (US distribution) sits outside this cap table.</w:t>
+        <w:t>Recommendation: price the kickoff on Lens A ($6M midpoint); pitch Lens B as the prize and the Series A thesis. Optionally test institutional-AI appetite for a larger round.</w:t>
       </w:r>
     </w:p>
     <w:p>
@@ -3426,10 +2580,10 @@
         <w:rPr>
           <w:b/>
         </w:rPr>
-        <w:t xml:space="preserve">IP contribution terms — </w:t>
+        <w:t xml:space="preserve">Device-vs-drug classification (#1) — </w:t>
       </w:r>
       <w:r>
-        <w:t>largely resolved by the JV (WBI contributes IP into Synapep), but the scope (fields, territories, exclusivity, reserved rights/royalties) must be documented.</w:t>
+        <w:t>an IM injectable peptide is very likely a drug/biologic, not a device, in Korea and HK. Lead the device fast-path with the microneedling/topical line + applicator system; run the IM/injectable line on a separate track.</w:t>
       </w:r>
     </w:p>
     <w:p>
@@ -3440,10 +2594,10 @@
         <w:rPr>
           <w:b/>
         </w:rPr>
-        <w:t xml:space="preserve">Customer concentration &amp; ramp — </w:t>
+        <w:t xml:space="preserve">"Same raw materials" constraint — </w:t>
       </w:r>
       <w:r>
-        <w:t>with an OEM model, revenue depends on a few anchor distributors/brands; landing the first 2–3 accounts is make-or-break in 2027.</w:t>
+        <w:t>personalise via device parameters within an approved envelope; changing the active molecule can break the fast path.</w:t>
       </w:r>
     </w:p>
     <w:p>
@@ -3454,10 +2608,10 @@
         <w:rPr>
           <w:b/>
         </w:rPr>
-        <w:t xml:space="preserve">Regulatory — </w:t>
+        <w:t xml:space="preserve">AI substantiation — </w:t>
       </w:r>
       <w:r>
-        <w:t>the cosmetic skin-booster pathway is fast, but exosome regulation is evolving; the medical line needs FDA/KFDA work. Keep cosmetic and medical claims separated.</w:t>
+        <w:t>the "outperforms generalised products" and data-moat claims need head-to-head efficacy evidence and a real ML capability/dataset behind the "own large model."</w:t>
       </w:r>
     </w:p>
     <w:p>
@@ -3468,10 +2622,24 @@
         <w:rPr>
           <w:b/>
         </w:rPr>
-        <w:t xml:space="preserve">Cold chain / ops — </w:t>
+        <w:t xml:space="preserve">SaMD exposure — </w:t>
       </w:r>
       <w:r>
-        <w:t>−80 °C storage and validated shipping add cost and failure modes; under-budgeting fill-finish and stability is a classic exosome pitfall.</w:t>
+        <w:t>CodeLife may be regulated as Software as a Medical Device; keep the physician in the loop within a cleared envelope.</w:t>
+      </w:r>
+    </w:p>
+    <w:p>
+      <w:pPr>
+        <w:pStyle w:val="ListBullet"/>
+      </w:pPr>
+      <w:r>
+        <w:rPr>
+          <w:b/>
+        </w:rPr>
+        <w:t xml:space="preserve">Incumbents — </w:t>
+      </w:r>
+      <w:r>
+        <w:t>HA/botox (~$5–6.5B, still growing) are not displaced — position as a new adjacent category.</w:t>
       </w:r>
     </w:p>
     <w:p>
@@ -3485,7 +2653,15 @@
         <w:t xml:space="preserve">Capital adequacy — </w:t>
       </w:r>
       <w:r>
-        <w:t>$1M kicks off; scaling to the modeled $29–39M revenue likely needs a 2028 Series A.</w:t>
+        <w:t>$1M kicks off; multi-market registration + clinical salesforce + AI team likely need a 2028 Series A.</w:t>
+      </w:r>
+    </w:p>
+    <w:p>
+      <w:pPr>
+        <w:pStyle w:val="Heading1"/>
+      </w:pPr>
+      <w:r>
+        <w:t>9. What Would Make This Investment-Grade</w:t>
       </w:r>
     </w:p>
     <w:p>
@@ -3496,18 +2672,24 @@
         <w:rPr>
           <w:b/>
         </w:rPr>
-        <w:t xml:space="preserve">Margin — </w:t>
+        <w:t xml:space="preserve">Confirm the regulatory split </w:t>
       </w:r>
       <w:r>
-        <w:t>largely de-risked: confirmed sub-$5 material cost keeps gross margin in a tight ~64–71% band even at the $30 EXW floor.</w:t>
+        <w:t>— microneedling/topical (device fast-path) vs IM injectable (drug).</w:t>
       </w:r>
     </w:p>
     <w:p>
       <w:pPr>
-        <w:pStyle w:val="Heading1"/>
+        <w:pStyle w:val="ListBullet"/>
       </w:pPr>
       <w:r>
-        <w:t>9. What Would Make This Plan Investment-Grade</w:t>
+        <w:rPr>
+          <w:b/>
+        </w:rPr>
+        <w:t xml:space="preserve">Produce head-to-head efficacy data </w:t>
+      </w:r>
+      <w:r>
+        <w:t>(AI-personalised vs generalised) and define the AI/data team and dataset plan behind the "own large model."</w:t>
       </w:r>
     </w:p>
     <w:p>
@@ -3521,7 +2703,7 @@
         <w:t xml:space="preserve">Document the IP-contribution scope </w:t>
       </w:r>
       <w:r>
-        <w:t>WBI assigns into the JV — the biggest single driver.</w:t>
+        <w:t>WBI assigns into the JV.</w:t>
       </w:r>
     </w:p>
     <w:p>
@@ -3532,38 +2714,10 @@
         <w:rPr>
           <w:b/>
         </w:rPr>
-        <w:t xml:space="preserve">Name the core team </w:t>
+        <w:t xml:space="preserve">Confirm device ASP/GM, clinic ramp, kits/clinic/month; </w:t>
       </w:r>
       <w:r>
-        <w:t>(the advisor bench already has real credibility).</w:t>
-      </w:r>
-    </w:p>
-    <w:p>
-      <w:pPr>
-        <w:pStyle w:val="ListBullet"/>
-      </w:pPr>
-      <w:r>
-        <w:rPr>
-          <w:b/>
-        </w:rPr>
-        <w:t xml:space="preserve">Confirm the 5–6 SKUs, </w:t>
-      </w:r>
-      <w:r>
-        <w:t>their volumes/prices, and an anchor-customer pipeline.</w:t>
-      </w:r>
-    </w:p>
-    <w:p>
-      <w:pPr>
-        <w:pStyle w:val="ListBullet"/>
-      </w:pPr>
-      <w:r>
-        <w:rPr>
-          <w:b/>
-        </w:rPr>
-        <w:t xml:space="preserve">Confirm material cost </w:t>
-      </w:r>
-      <w:r>
-        <w:t>and that cold-chain/fill-finish are inside the COGS formula.</w:t>
+        <w:t>name the core team and an anchor-clinic pipeline in Korea/HK.</w:t>
       </w:r>
     </w:p>
     <w:p/>
@@ -3578,7 +2732,7 @@
           <w:color w:val="555555"/>
           <w:sz w:val="18"/>
         </w:rPr>
-        <w:t>Appendix — source materials (WBI/NeuNova/SynExo documents and patent filings) are held in the user's Google Drive; key figures in this document are grounded in those files. OpEx is an internal assumption pending a headcount/spend plan.</w:t>
+        <w:t>Sources — medical aesthetics market: MarketsandMarkets, P&amp;S Intelligence, DataM. Korea MFDS modified-device path: Emergo by UL, ElendiLabs, MedDeviceGuide. Hong Kong MDACS: mdd.gov.hk, Asia Actual. Botox/HA: Future Market Insights, Allied Market Research, Grand View Research.</w:t>
       </w:r>
     </w:p>
     <w:sectPr>

</xml_diff>

<commit_message>
Synapep v0.4: add AI & data-science build plan & cost section; regenerate docs
</commit_message>
<xml_diff>
--- a/synexo/Synapep_Business_Plan_and_Valuation.docx
+++ b/synexo/Synapep_Business_Plan_and_Valuation.docx
@@ -679,7 +679,754 @@
         <w:pStyle w:val="Heading1"/>
       </w:pPr>
       <w:r>
-        <w:t>6. Financial Model</w:t>
+        <w:t>6. AI &amp; Data-Science Build Plan &amp; Costs</w:t>
+      </w:r>
+    </w:p>
+    <w:p>
+      <w:pPr>
+        <w:spacing w:after="120"/>
+      </w:pPr>
+      <w:r>
+        <w:rPr>
+          <w:b w:val="0"/>
+          <w:i w:val="0"/>
+          <w:sz w:val="21"/>
+        </w:rPr>
+        <w:t>How Pillar 1 (the moat) gets built — and what it costs. All AI/data spend below is a subset of the OpEx "R&amp;D incl. AI" line, not additional.</w:t>
+      </w:r>
+    </w:p>
+    <w:tbl>
+      <w:tblPr>
+        <w:tblStyle w:val="LightGrid-Accent1"/>
+        <w:tblW w:type="auto" w:w="0"/>
+        <w:jc w:val="center"/>
+        <w:tblLook w:firstColumn="1" w:firstRow="1" w:lastColumn="0" w:lastRow="0" w:noHBand="0" w:noVBand="1" w:val="04A0"/>
+      </w:tblPr>
+      <w:tblGrid>
+        <w:gridCol w:w="2880"/>
+        <w:gridCol w:w="2880"/>
+        <w:gridCol w:w="2880"/>
+      </w:tblGrid>
+      <w:tr>
+        <w:tc>
+          <w:tcPr>
+            <w:tcW w:type="dxa" w:w="2160"/>
+          </w:tcPr>
+          <w:p>
+            <w:r>
+              <w:rPr>
+                <w:b/>
+                <w:sz w:val="19"/>
+              </w:rPr>
+              <w:t>Phase</w:t>
+            </w:r>
+          </w:p>
+        </w:tc>
+        <w:tc>
+          <w:tcPr>
+            <w:tcW w:type="dxa" w:w="1440"/>
+          </w:tcPr>
+          <w:p>
+            <w:r>
+              <w:rPr>
+                <w:b/>
+                <w:sz w:val="19"/>
+              </w:rPr>
+              <w:t>Window</w:t>
+            </w:r>
+          </w:p>
+        </w:tc>
+        <w:tc>
+          <w:tcPr>
+            <w:tcW w:type="dxa" w:w="5760"/>
+          </w:tcPr>
+          <w:p>
+            <w:r>
+              <w:rPr>
+                <w:b/>
+                <w:sz w:val="19"/>
+              </w:rPr>
+              <w:t>Deliverables</w:t>
+            </w:r>
+          </w:p>
+        </w:tc>
+      </w:tr>
+      <w:tr>
+        <w:tc>
+          <w:tcPr>
+            <w:tcW w:type="dxa" w:w="2160"/>
+          </w:tcPr>
+          <w:p>
+            <w:r>
+              <w:rPr>
+                <w:sz w:val="19"/>
+              </w:rPr>
+              <w:t>1 — Foundation</w:t>
+            </w:r>
+          </w:p>
+        </w:tc>
+        <w:tc>
+          <w:tcPr>
+            <w:tcW w:type="dxa" w:w="1440"/>
+          </w:tcPr>
+          <w:p>
+            <w:r>
+              <w:rPr>
+                <w:sz w:val="19"/>
+              </w:rPr>
+              <w:t>2026</w:t>
+            </w:r>
+          </w:p>
+        </w:tc>
+        <w:tc>
+          <w:tcPr>
+            <w:tcW w:type="dxa" w:w="5760"/>
+          </w:tcPr>
+          <w:p>
+            <w:r>
+              <w:rPr>
+                <w:sz w:val="19"/>
+              </w:rPr>
+              <w:t>Data schema + device-side capture pipeline (consented inputs, settings, images); CodeLife v1 configuration engine within the approved envelope; AI-QA tooling (batch/variant validation, anomaly detection).</w:t>
+            </w:r>
+          </w:p>
+        </w:tc>
+      </w:tr>
+      <w:tr>
+        <w:tc>
+          <w:tcPr>
+            <w:tcW w:type="dxa" w:w="2160"/>
+          </w:tcPr>
+          <w:p>
+            <w:r>
+              <w:rPr>
+                <w:sz w:val="19"/>
+              </w:rPr>
+              <w:t>2 — Data flywheel</w:t>
+            </w:r>
+          </w:p>
+        </w:tc>
+        <w:tc>
+          <w:tcPr>
+            <w:tcW w:type="dxa" w:w="1440"/>
+          </w:tcPr>
+          <w:p>
+            <w:r>
+              <w:rPr>
+                <w:sz w:val="19"/>
+              </w:rPr>
+              <w:t>2027–28</w:t>
+            </w:r>
+          </w:p>
+        </w:tc>
+        <w:tc>
+          <w:tcPr>
+            <w:tcW w:type="dxa" w:w="5760"/>
+          </w:tcPr>
+          <w:p>
+            <w:r>
+              <w:rPr>
+                <w:sz w:val="19"/>
+              </w:rPr>
+              <w:t>Live outcome capture from clinics; models linking formulation/device parameters → outcomes; proprietary dataset compounds; physician dashboards (beta).</w:t>
+            </w:r>
+          </w:p>
+        </w:tc>
+      </w:tr>
+      <w:tr>
+        <w:tc>
+          <w:tcPr>
+            <w:tcW w:type="dxa" w:w="2160"/>
+          </w:tcPr>
+          <w:p>
+            <w:r>
+              <w:rPr>
+                <w:sz w:val="19"/>
+              </w:rPr>
+              <w:t>3 — Own large model</w:t>
+            </w:r>
+          </w:p>
+        </w:tc>
+        <w:tc>
+          <w:tcPr>
+            <w:tcW w:type="dxa" w:w="1440"/>
+          </w:tcPr>
+          <w:p>
+            <w:r>
+              <w:rPr>
+                <w:sz w:val="19"/>
+              </w:rPr>
+              <w:t>2029–30</w:t>
+            </w:r>
+          </w:p>
+        </w:tc>
+        <w:tc>
+          <w:tcPr>
+            <w:tcW w:type="dxa" w:w="5760"/>
+          </w:tcPr>
+          <w:p>
+            <w:r>
+              <w:rPr>
+                <w:sz w:val="19"/>
+              </w:rPr>
+              <w:t>Train a proprietary aesthetic-medicine model on multimodal data (images + formulations + outcomes); ship physician outcome-analytics products (Pillar 3 upside).</w:t>
+            </w:r>
+          </w:p>
+        </w:tc>
+      </w:tr>
+    </w:tbl>
+    <w:p>
+      <w:pPr>
+        <w:spacing w:after="40"/>
+      </w:pPr>
+    </w:p>
+    <w:p>
+      <w:pPr>
+        <w:pStyle w:val="Heading2"/>
+      </w:pPr>
+      <w:r>
+        <w:t>6.1 Team &amp; cost (AI/data subset of OpEx, $000s)</w:t>
+      </w:r>
+    </w:p>
+    <w:tbl>
+      <w:tblPr>
+        <w:tblStyle w:val="LightGrid-Accent1"/>
+        <w:tblW w:type="auto" w:w="0"/>
+        <w:jc w:val="center"/>
+        <w:tblLook w:firstColumn="1" w:firstRow="1" w:lastColumn="0" w:lastRow="0" w:noHBand="0" w:noVBand="1" w:val="04A0"/>
+      </w:tblPr>
+      <w:tblGrid>
+        <w:gridCol w:w="1440"/>
+        <w:gridCol w:w="1440"/>
+        <w:gridCol w:w="1440"/>
+        <w:gridCol w:w="1440"/>
+        <w:gridCol w:w="1440"/>
+        <w:gridCol w:w="1440"/>
+      </w:tblGrid>
+      <w:tr>
+        <w:tc>
+          <w:tcPr>
+            <w:tcW w:type="dxa" w:w="1008"/>
+          </w:tcPr>
+          <w:p>
+            <w:r>
+              <w:rPr>
+                <w:b/>
+                <w:sz w:val="19"/>
+              </w:rPr>
+              <w:t>Year</w:t>
+            </w:r>
+          </w:p>
+        </w:tc>
+        <w:tc>
+          <w:tcPr>
+            <w:tcW w:type="dxa" w:w="1440"/>
+          </w:tcPr>
+          <w:p>
+            <w:r>
+              <w:rPr>
+                <w:b/>
+                <w:sz w:val="19"/>
+              </w:rPr>
+              <w:t>AI/data FTE</w:t>
+            </w:r>
+          </w:p>
+        </w:tc>
+        <w:tc>
+          <w:tcPr>
+            <w:tcW w:type="dxa" w:w="1440"/>
+          </w:tcPr>
+          <w:p>
+            <w:r>
+              <w:rPr>
+                <w:b/>
+                <w:sz w:val="19"/>
+              </w:rPr>
+              <w:t>Personnel</w:t>
+            </w:r>
+          </w:p>
+        </w:tc>
+        <w:tc>
+          <w:tcPr>
+            <w:tcW w:type="dxa" w:w="2016"/>
+          </w:tcPr>
+          <w:p>
+            <w:r>
+              <w:rPr>
+                <w:b/>
+                <w:sz w:val="19"/>
+              </w:rPr>
+              <w:t>Compute &amp; data ops</w:t>
+            </w:r>
+          </w:p>
+        </w:tc>
+        <w:tc>
+          <w:tcPr>
+            <w:tcW w:type="dxa" w:w="1728"/>
+          </w:tcPr>
+          <w:p>
+            <w:r>
+              <w:rPr>
+                <w:b/>
+                <w:sz w:val="19"/>
+              </w:rPr>
+              <w:t>Total AI spend</w:t>
+            </w:r>
+          </w:p>
+        </w:tc>
+        <w:tc>
+          <w:tcPr>
+            <w:tcW w:type="dxa" w:w="1584"/>
+          </w:tcPr>
+          <w:p>
+            <w:r>
+              <w:rPr>
+                <w:b/>
+                <w:sz w:val="19"/>
+              </w:rPr>
+              <w:t>(Total OpEx)</w:t>
+            </w:r>
+          </w:p>
+        </w:tc>
+      </w:tr>
+      <w:tr>
+        <w:tc>
+          <w:tcPr>
+            <w:tcW w:type="dxa" w:w="1008"/>
+          </w:tcPr>
+          <w:p>
+            <w:r>
+              <w:rPr>
+                <w:sz w:val="19"/>
+              </w:rPr>
+              <w:t>2026</w:t>
+            </w:r>
+          </w:p>
+        </w:tc>
+        <w:tc>
+          <w:tcPr>
+            <w:tcW w:type="dxa" w:w="1440"/>
+          </w:tcPr>
+          <w:p>
+            <w:r>
+              <w:rPr>
+                <w:sz w:val="19"/>
+              </w:rPr>
+              <w:t>2</w:t>
+            </w:r>
+          </w:p>
+        </w:tc>
+        <w:tc>
+          <w:tcPr>
+            <w:tcW w:type="dxa" w:w="1440"/>
+          </w:tcPr>
+          <w:p>
+            <w:r>
+              <w:rPr>
+                <w:sz w:val="19"/>
+              </w:rPr>
+              <w:t>250</w:t>
+            </w:r>
+          </w:p>
+        </w:tc>
+        <w:tc>
+          <w:tcPr>
+            <w:tcW w:type="dxa" w:w="2016"/>
+          </w:tcPr>
+          <w:p>
+            <w:r>
+              <w:rPr>
+                <w:sz w:val="19"/>
+              </w:rPr>
+              <w:t>50</w:t>
+            </w:r>
+          </w:p>
+        </w:tc>
+        <w:tc>
+          <w:tcPr>
+            <w:tcW w:type="dxa" w:w="1728"/>
+          </w:tcPr>
+          <w:p>
+            <w:r>
+              <w:rPr>
+                <w:sz w:val="19"/>
+              </w:rPr>
+              <w:t>300</w:t>
+            </w:r>
+          </w:p>
+        </w:tc>
+        <w:tc>
+          <w:tcPr>
+            <w:tcW w:type="dxa" w:w="1584"/>
+          </w:tcPr>
+          <w:p>
+            <w:r>
+              <w:rPr>
+                <w:sz w:val="19"/>
+              </w:rPr>
+              <w:t>(700)</w:t>
+            </w:r>
+          </w:p>
+        </w:tc>
+      </w:tr>
+      <w:tr>
+        <w:tc>
+          <w:tcPr>
+            <w:tcW w:type="dxa" w:w="1008"/>
+          </w:tcPr>
+          <w:p>
+            <w:r>
+              <w:rPr>
+                <w:sz w:val="19"/>
+              </w:rPr>
+              <w:t>2027</w:t>
+            </w:r>
+          </w:p>
+        </w:tc>
+        <w:tc>
+          <w:tcPr>
+            <w:tcW w:type="dxa" w:w="1440"/>
+          </w:tcPr>
+          <w:p>
+            <w:r>
+              <w:rPr>
+                <w:sz w:val="19"/>
+              </w:rPr>
+              <w:t>4</w:t>
+            </w:r>
+          </w:p>
+        </w:tc>
+        <w:tc>
+          <w:tcPr>
+            <w:tcW w:type="dxa" w:w="1440"/>
+          </w:tcPr>
+          <w:p>
+            <w:r>
+              <w:rPr>
+                <w:sz w:val="19"/>
+              </w:rPr>
+              <w:t>600</w:t>
+            </w:r>
+          </w:p>
+        </w:tc>
+        <w:tc>
+          <w:tcPr>
+            <w:tcW w:type="dxa" w:w="2016"/>
+          </w:tcPr>
+          <w:p>
+            <w:r>
+              <w:rPr>
+                <w:sz w:val="19"/>
+              </w:rPr>
+              <w:t>100</w:t>
+            </w:r>
+          </w:p>
+        </w:tc>
+        <w:tc>
+          <w:tcPr>
+            <w:tcW w:type="dxa" w:w="1728"/>
+          </w:tcPr>
+          <w:p>
+            <w:r>
+              <w:rPr>
+                <w:sz w:val="19"/>
+              </w:rPr>
+              <w:t>700</w:t>
+            </w:r>
+          </w:p>
+        </w:tc>
+        <w:tc>
+          <w:tcPr>
+            <w:tcW w:type="dxa" w:w="1584"/>
+          </w:tcPr>
+          <w:p>
+            <w:r>
+              <w:rPr>
+                <w:sz w:val="19"/>
+              </w:rPr>
+              <w:t>(2,600)</w:t>
+            </w:r>
+          </w:p>
+        </w:tc>
+      </w:tr>
+      <w:tr>
+        <w:tc>
+          <w:tcPr>
+            <w:tcW w:type="dxa" w:w="1008"/>
+          </w:tcPr>
+          <w:p>
+            <w:r>
+              <w:rPr>
+                <w:sz w:val="19"/>
+              </w:rPr>
+              <w:t>2028</w:t>
+            </w:r>
+          </w:p>
+        </w:tc>
+        <w:tc>
+          <w:tcPr>
+            <w:tcW w:type="dxa" w:w="1440"/>
+          </w:tcPr>
+          <w:p>
+            <w:r>
+              <w:rPr>
+                <w:sz w:val="19"/>
+              </w:rPr>
+              <w:t>7</w:t>
+            </w:r>
+          </w:p>
+        </w:tc>
+        <w:tc>
+          <w:tcPr>
+            <w:tcW w:type="dxa" w:w="1440"/>
+          </w:tcPr>
+          <w:p>
+            <w:r>
+              <w:rPr>
+                <w:sz w:val="19"/>
+              </w:rPr>
+              <w:t>1,050</w:t>
+            </w:r>
+          </w:p>
+        </w:tc>
+        <w:tc>
+          <w:tcPr>
+            <w:tcW w:type="dxa" w:w="2016"/>
+          </w:tcPr>
+          <w:p>
+            <w:r>
+              <w:rPr>
+                <w:sz w:val="19"/>
+              </w:rPr>
+              <w:t>250</w:t>
+            </w:r>
+          </w:p>
+        </w:tc>
+        <w:tc>
+          <w:tcPr>
+            <w:tcW w:type="dxa" w:w="1728"/>
+          </w:tcPr>
+          <w:p>
+            <w:r>
+              <w:rPr>
+                <w:sz w:val="19"/>
+              </w:rPr>
+              <w:t>1,300</w:t>
+            </w:r>
+          </w:p>
+        </w:tc>
+        <w:tc>
+          <w:tcPr>
+            <w:tcW w:type="dxa" w:w="1584"/>
+          </w:tcPr>
+          <w:p>
+            <w:r>
+              <w:rPr>
+                <w:sz w:val="19"/>
+              </w:rPr>
+              <w:t>(6,000)</w:t>
+            </w:r>
+          </w:p>
+        </w:tc>
+      </w:tr>
+      <w:tr>
+        <w:tc>
+          <w:tcPr>
+            <w:tcW w:type="dxa" w:w="1008"/>
+          </w:tcPr>
+          <w:p>
+            <w:r>
+              <w:rPr>
+                <w:sz w:val="19"/>
+              </w:rPr>
+              <w:t>2029</w:t>
+            </w:r>
+          </w:p>
+        </w:tc>
+        <w:tc>
+          <w:tcPr>
+            <w:tcW w:type="dxa" w:w="1440"/>
+          </w:tcPr>
+          <w:p>
+            <w:r>
+              <w:rPr>
+                <w:sz w:val="19"/>
+              </w:rPr>
+              <w:t>10</w:t>
+            </w:r>
+          </w:p>
+        </w:tc>
+        <w:tc>
+          <w:tcPr>
+            <w:tcW w:type="dxa" w:w="1440"/>
+          </w:tcPr>
+          <w:p>
+            <w:r>
+              <w:rPr>
+                <w:sz w:val="19"/>
+              </w:rPr>
+              <w:t>1,600</w:t>
+            </w:r>
+          </w:p>
+        </w:tc>
+        <w:tc>
+          <w:tcPr>
+            <w:tcW w:type="dxa" w:w="2016"/>
+          </w:tcPr>
+          <w:p>
+            <w:r>
+              <w:rPr>
+                <w:sz w:val="19"/>
+              </w:rPr>
+              <w:t>400</w:t>
+            </w:r>
+          </w:p>
+        </w:tc>
+        <w:tc>
+          <w:tcPr>
+            <w:tcW w:type="dxa" w:w="1728"/>
+          </w:tcPr>
+          <w:p>
+            <w:r>
+              <w:rPr>
+                <w:sz w:val="19"/>
+              </w:rPr>
+              <w:t>2,000</w:t>
+            </w:r>
+          </w:p>
+        </w:tc>
+        <w:tc>
+          <w:tcPr>
+            <w:tcW w:type="dxa" w:w="1584"/>
+          </w:tcPr>
+          <w:p>
+            <w:r>
+              <w:rPr>
+                <w:sz w:val="19"/>
+              </w:rPr>
+              <w:t>(8,200)</w:t>
+            </w:r>
+          </w:p>
+        </w:tc>
+      </w:tr>
+      <w:tr>
+        <w:tc>
+          <w:tcPr>
+            <w:tcW w:type="dxa" w:w="1008"/>
+          </w:tcPr>
+          <w:p>
+            <w:r>
+              <w:rPr>
+                <w:sz w:val="19"/>
+              </w:rPr>
+              <w:t>2030</w:t>
+            </w:r>
+          </w:p>
+        </w:tc>
+        <w:tc>
+          <w:tcPr>
+            <w:tcW w:type="dxa" w:w="1440"/>
+          </w:tcPr>
+          <w:p>
+            <w:r>
+              <w:rPr>
+                <w:sz w:val="19"/>
+              </w:rPr>
+              <w:t>12</w:t>
+            </w:r>
+          </w:p>
+        </w:tc>
+        <w:tc>
+          <w:tcPr>
+            <w:tcW w:type="dxa" w:w="1440"/>
+          </w:tcPr>
+          <w:p>
+            <w:r>
+              <w:rPr>
+                <w:sz w:val="19"/>
+              </w:rPr>
+              <w:t>2,000</w:t>
+            </w:r>
+          </w:p>
+        </w:tc>
+        <w:tc>
+          <w:tcPr>
+            <w:tcW w:type="dxa" w:w="2016"/>
+          </w:tcPr>
+          <w:p>
+            <w:r>
+              <w:rPr>
+                <w:sz w:val="19"/>
+              </w:rPr>
+              <w:t>600</w:t>
+            </w:r>
+          </w:p>
+        </w:tc>
+        <w:tc>
+          <w:tcPr>
+            <w:tcW w:type="dxa" w:w="1728"/>
+          </w:tcPr>
+          <w:p>
+            <w:r>
+              <w:rPr>
+                <w:sz w:val="19"/>
+              </w:rPr>
+              <w:t>2,600</w:t>
+            </w:r>
+          </w:p>
+        </w:tc>
+        <w:tc>
+          <w:tcPr>
+            <w:tcW w:type="dxa" w:w="1584"/>
+          </w:tcPr>
+          <w:p>
+            <w:r>
+              <w:rPr>
+                <w:sz w:val="19"/>
+              </w:rPr>
+              <w:t>(10,000)</w:t>
+            </w:r>
+          </w:p>
+        </w:tc>
+      </w:tr>
+    </w:tbl>
+    <w:p>
+      <w:pPr>
+        <w:spacing w:after="40"/>
+      </w:pPr>
+    </w:p>
+    <w:p>
+      <w:pPr>
+        <w:spacing w:after="120"/>
+      </w:pPr>
+      <w:r>
+        <w:rPr>
+          <w:b w:val="0"/>
+          <w:i w:val="0"/>
+          <w:sz w:val="21"/>
+        </w:rPr>
+        <w:t>Core roles: ML/AI lead (peptide design + model strategy), data/ML engineers, data-platform/MLOps, clinical-data/annotation, regulatory-aware ML (SaMD). Recruit the ML/AI lead and a data engineer first (2026); scale annotation and MLOps as clinic data arrives.</w:t>
+      </w:r>
+    </w:p>
+    <w:p>
+      <w:pPr>
+        <w:spacing w:after="120"/>
+      </w:pPr>
+      <w:r>
+        <w:rPr>
+          <w:b w:val="0"/>
+          <w:i w:val="0"/>
+          <w:sz w:val="21"/>
+        </w:rPr>
+        <w:t>Data moat: every CodeLife-configured treatment generates consented inputs, device parameters and (where permitted) outcome data via the applicator device. More treatments → better models → peptides that outperform generalised products → more clinics → more data. The dataset, not the code, is the durable moat — and the line item that turns Synapep from a medtech story (Lens A) into an AI/data-company story (Lens B). Governance: consent, de-identification, Korea/HK data-protection compliance, physician in the loop.</w:t>
+      </w:r>
+    </w:p>
+    <w:p>
+      <w:pPr>
+        <w:pStyle w:val="Heading1"/>
+      </w:pPr>
+      <w:r>
+        <w:t>7. Financial Model</w:t>
       </w:r>
     </w:p>
     <w:p>
@@ -1047,7 +1794,7 @@
         <w:pStyle w:val="Heading2"/>
       </w:pPr>
       <w:r>
-        <w:t>6.1 P&amp;L ($ thousands)</w:t>
+        <w:t>7.1 P&amp;L ($ thousands)</w:t>
       </w:r>
     </w:p>
     <w:tbl>
@@ -1882,7 +2629,7 @@
         <w:pStyle w:val="Heading2"/>
       </w:pPr>
       <w:r>
-        <w:t>6.2 Scenarios (2029)</w:t>
+        <w:t>7.2 Scenarios (2029)</w:t>
       </w:r>
     </w:p>
     <w:tbl>
@@ -2196,7 +2943,7 @@
         <w:pStyle w:val="Heading1"/>
       </w:pPr>
       <w:r>
-        <w:t>7. Valuation — Two Lenses</w:t>
+        <w:t>8. Valuation — Two Lenses</w:t>
       </w:r>
     </w:p>
     <w:p>
@@ -2256,7 +3003,7 @@
         <w:pStyle w:val="Heading2"/>
       </w:pPr>
       <w:r>
-        <w:t>7.1 Cap table (post-raise, $6.0M pre-money)</w:t>
+        <w:t>8.1 Cap table (post-raise, $6.0M pre-money)</w:t>
       </w:r>
     </w:p>
     <w:tbl>
@@ -2569,7 +3316,7 @@
         <w:pStyle w:val="Heading1"/>
       </w:pPr>
       <w:r>
-        <w:t>8. Key Risks</w:t>
+        <w:t>9. Key Risks</w:t>
       </w:r>
     </w:p>
     <w:p>
@@ -2661,7 +3408,7 @@
         <w:pStyle w:val="Heading1"/>
       </w:pPr>
       <w:r>
-        <w:t>9. What Would Make This Investment-Grade</w:t>
+        <w:t>10. What Would Make This Investment-Grade</w:t>
       </w:r>
     </w:p>
     <w:p>

</xml_diff>

<commit_message>
Add investor DD scorecard, milestone-gated SAFE term sheet, export strategy; pre-emption + export sections in business plan
</commit_message>
<xml_diff>
--- a/synexo/Synapep_Business_Plan_and_Valuation.docx
+++ b/synexo/Synapep_Business_Plan_and_Valuation.docx
@@ -3316,7 +3316,380 @@
         <w:pStyle w:val="Heading1"/>
       </w:pPr>
       <w:r>
-        <w:t>9. Key Risks</w:t>
+        <w:t>9. What a Technical Investor Will Challenge (and Our Answer)</w:t>
+      </w:r>
+    </w:p>
+    <w:p>
+      <w:pPr>
+        <w:spacing w:after="120"/>
+      </w:pPr>
+      <w:r>
+        <w:rPr>
+          <w:b w:val="0"/>
+          <w:i w:val="0"/>
+          <w:sz w:val="21"/>
+        </w:rPr>
+        <w:t>A chemical-engineer investor entering aesthetics will press these; pre-empting them:</w:t>
+      </w:r>
+    </w:p>
+    <w:tbl>
+      <w:tblPr>
+        <w:tblStyle w:val="LightGrid-Accent1"/>
+        <w:tblW w:type="auto" w:w="0"/>
+        <w:jc w:val="center"/>
+        <w:tblLook w:firstColumn="1" w:firstRow="1" w:lastColumn="0" w:lastRow="0" w:noHBand="0" w:noVBand="1" w:val="04A0"/>
+      </w:tblPr>
+      <w:tblGrid>
+        <w:gridCol w:w="4320"/>
+        <w:gridCol w:w="4320"/>
+      </w:tblGrid>
+      <w:tr>
+        <w:tc>
+          <w:tcPr>
+            <w:tcW w:type="dxa" w:w="3744"/>
+          </w:tcPr>
+          <w:p>
+            <w:r>
+              <w:rPr>
+                <w:b/>
+                <w:sz w:val="19"/>
+              </w:rPr>
+              <w:t>Challenge</w:t>
+            </w:r>
+          </w:p>
+        </w:tc>
+        <w:tc>
+          <w:tcPr>
+            <w:tcW w:type="dxa" w:w="5616"/>
+          </w:tcPr>
+          <w:p>
+            <w:r>
+              <w:rPr>
+                <w:b/>
+                <w:sz w:val="19"/>
+              </w:rPr>
+              <w:t>Our answer / action</w:t>
+            </w:r>
+          </w:p>
+        </w:tc>
+      </w:tr>
+      <w:tr>
+        <w:tc>
+          <w:tcPr>
+            <w:tcW w:type="dxa" w:w="3744"/>
+          </w:tcPr>
+          <w:p>
+            <w:r>
+              <w:rPr>
+                <w:sz w:val="19"/>
+              </w:rPr>
+              <w:t>Cold chain &amp; COGS are asserted, not built (−80 °C is unshippable to clinics; COGS is top-down with no BOM).</w:t>
+            </w:r>
+          </w:p>
+        </w:tc>
+        <w:tc>
+          <w:tcPr>
+            <w:tcW w:type="dxa" w:w="5616"/>
+          </w:tcPr>
+          <w:p>
+            <w:r>
+              <w:rPr>
+                <w:sz w:val="19"/>
+              </w:rPr>
+              <w:t>Resolve stability to 2–8 °C / ambient (or cost the cold chain) and publish a bottom-up BOM incl. per-batch QC-release cost; treat early-year margins as lower until scale.</w:t>
+            </w:r>
+          </w:p>
+        </w:tc>
+      </w:tr>
+      <w:tr>
+        <w:tc>
+          <w:tcPr>
+            <w:tcW w:type="dxa" w:w="3744"/>
+          </w:tcPr>
+          <w:p>
+            <w:r>
+              <w:rPr>
+                <w:sz w:val="19"/>
+              </w:rPr>
+              <w:t>Personalisation vs "same raw materials" is a contradiction — real personalisation changes the active and breaks the device fast-path.</w:t>
+            </w:r>
+          </w:p>
+        </w:tc>
+        <w:tc>
+          <w:tcPr>
+            <w:tcW w:type="dxa" w:w="5616"/>
+          </w:tcPr>
+          <w:p>
+            <w:r>
+              <w:rPr>
+                <w:sz w:val="19"/>
+              </w:rPr>
+              <w:t>Personalisation lives in a pre-cleared configuration envelope (delivery, depth, concentration range, option menu) — defended as both regulatorily clean and clinically differentiating.</w:t>
+            </w:r>
+          </w:p>
+        </w:tc>
+      </w:tr>
+      <w:tr>
+        <w:tc>
+          <w:tcPr>
+            <w:tcW w:type="dxa" w:w="3744"/>
+          </w:tcPr>
+          <w:p>
+            <w:r>
+              <w:rPr>
+                <w:sz w:val="19"/>
+              </w:rPr>
+              <w:t>Exosomes are a regulatory/characterisation minefield (Korea ad ban; EU human-exosome ban; US FDA warnings).</w:t>
+            </w:r>
+          </w:p>
+        </w:tc>
+        <w:tc>
+          <w:tcPr>
+            <w:tcW w:type="dxa" w:w="5616"/>
+          </w:tcPr>
+          <w:p>
+            <w:r>
+              <w:rPr>
+                <w:sz w:val="19"/>
+              </w:rPr>
+              <w:t>Lead with non-human (salmon/synthetic) origin; provide COA/particle/potency/purity/stability/batch data; market on function, not medical claims.</w:t>
+            </w:r>
+          </w:p>
+        </w:tc>
+      </w:tr>
+      <w:tr>
+        <w:tc>
+          <w:tcPr>
+            <w:tcW w:type="dxa" w:w="3744"/>
+          </w:tcPr>
+          <w:p>
+            <w:r>
+              <w:rPr>
+                <w:sz w:val="19"/>
+              </w:rPr>
+              <w:t>"$25M exposure" is weasel-phrased — it aggregates affiliated entities.</w:t>
+            </w:r>
+          </w:p>
+        </w:tc>
+        <w:tc>
+          <w:tcPr>
+            <w:tcW w:type="dxa" w:w="5616"/>
+          </w:tcPr>
+          <w:p>
+            <w:r>
+              <w:rPr>
+                <w:sz w:val="19"/>
+              </w:rPr>
+              <w:t>Re-present at entity/product/channel level with reorder data; weight as market signal, not Synapep revenue.</w:t>
+            </w:r>
+          </w:p>
+        </w:tc>
+      </w:tr>
+      <w:tr>
+        <w:tc>
+          <w:tcPr>
+            <w:tcW w:type="dxa" w:w="3744"/>
+          </w:tcPr>
+          <w:p>
+            <w:r>
+              <w:rPr>
+                <w:sz w:val="19"/>
+              </w:rPr>
+              <w:t>"Own large model" overreaches for a 2→12 FTE team.</w:t>
+            </w:r>
+          </w:p>
+        </w:tc>
+        <w:tc>
+          <w:tcPr>
+            <w:tcW w:type="dxa" w:w="5616"/>
+          </w:tcPr>
+          <w:p>
+            <w:r>
+              <w:rPr>
+                <w:sz w:val="19"/>
+              </w:rPr>
+              <w:t>Reframe as a structured, consented outcomes dataset + decision-support analytics; moat is data + clinic data-rights clauses.</w:t>
+            </w:r>
+          </w:p>
+        </w:tc>
+      </w:tr>
+      <w:tr>
+        <w:tc>
+          <w:tcPr>
+            <w:tcW w:type="dxa" w:w="3744"/>
+          </w:tcPr>
+          <w:p>
+            <w:r>
+              <w:rPr>
+                <w:sz w:val="19"/>
+              </w:rPr>
+              <w:t>Clinic ramp is aggressive (0→150 in year one; plan itself calls 150 'upside').</w:t>
+            </w:r>
+          </w:p>
+        </w:tc>
+        <w:tc>
+          <w:tcPr>
+            <w:tcW w:type="dxa" w:w="5616"/>
+          </w:tcPr>
+          <w:p>
+            <w:r>
+              <w:rPr>
+                <w:sz w:val="19"/>
+              </w:rPr>
+              <w:t>Rebuild the base off anchor-clinic actuals (real kits/clinic/month + reorder cohorts) before scaling capital.</w:t>
+            </w:r>
+          </w:p>
+        </w:tc>
+      </w:tr>
+    </w:tbl>
+    <w:p>
+      <w:pPr>
+        <w:spacing w:after="40"/>
+      </w:pPr>
+    </w:p>
+    <w:p>
+      <w:pPr>
+        <w:pStyle w:val="Heading1"/>
+      </w:pPr>
+      <w:r>
+        <w:t>10. International Expansion (KFDA as an Export Springboard)</w:t>
+      </w:r>
+    </w:p>
+    <w:p>
+      <w:pPr>
+        <w:spacing w:after="120"/>
+      </w:pPr>
+      <w:r>
+        <w:rPr>
+          <w:b w:val="0"/>
+          <w:i w:val="0"/>
+          <w:sz w:val="21"/>
+        </w:rPr>
+        <w:t>Synapep is not a Korea-only play: a Korean MFDS registration anchors a reliance-led export strategy (full detail in export-strategy.md). Two-speed thesis — the applicator device travels widely on the Korean technical file; the peptide/exosome kit is wrapped per market (cosmetic vs device vs drug), leaning on salmon/synthetic origin and strict claim discipline.</w:t>
+      </w:r>
+    </w:p>
+    <w:tbl>
+      <w:tblPr>
+        <w:tblStyle w:val="LightGrid-Accent1"/>
+        <w:tblW w:type="auto" w:w="0"/>
+        <w:jc w:val="center"/>
+        <w:tblLook w:firstColumn="1" w:firstRow="1" w:lastColumn="0" w:lastRow="0" w:noHBand="0" w:noVBand="1" w:val="04A0"/>
+      </w:tblPr>
+      <w:tblGrid>
+        <w:gridCol w:w="4320"/>
+        <w:gridCol w:w="4320"/>
+      </w:tblGrid>
+      <w:tr>
+        <w:tc>
+          <w:tcPr>
+            <w:tcW w:type="dxa" w:w="3168"/>
+          </w:tcPr>
+          <w:p>
+            <w:r>
+              <w:rPr>
+                <w:b/>
+                <w:sz w:val="19"/>
+              </w:rPr>
+              <w:t>Tier</w:t>
+            </w:r>
+          </w:p>
+        </w:tc>
+        <w:tc>
+          <w:tcPr>
+            <w:tcW w:type="dxa" w:w="6192"/>
+          </w:tcPr>
+          <w:p>
+            <w:r>
+              <w:rPr>
+                <w:b/>
+                <w:sz w:val="19"/>
+              </w:rPr>
+              <w:t>Markets &amp; KFDA leverage</w:t>
+            </w:r>
+          </w:p>
+        </w:tc>
+      </w:tr>
+      <w:tr>
+        <w:tc>
+          <w:tcPr>
+            <w:tcW w:type="dxa" w:w="3168"/>
+          </w:tcPr>
+          <w:p>
+            <w:r>
+              <w:rPr>
+                <w:sz w:val="19"/>
+              </w:rPr>
+              <w:t>Tier 1 — ASEAN + Hong Kong (fastest)</w:t>
+            </w:r>
+          </w:p>
+        </w:tc>
+        <w:tc>
+          <w:tcPr>
+            <w:tcW w:type="dxa" w:w="6192"/>
+          </w:tcPr>
+          <w:p>
+            <w:r>
+              <w:rPr>
+                <w:sz w:val="19"/>
+              </w:rPr>
+              <w:t>Hong Kong MDACS recognises Korea MFDS as a reference regulator (pair Korea + Singapore for the ≥2-reference expedited route); Vietnam accepts MFDS certifications; Singapore HSA is the gateway; one ASEAN AMDD/CSDT dossier cascades to Thailand, Malaysia, Indonesia, Philippines.</w:t>
+            </w:r>
+          </w:p>
+        </w:tc>
+      </w:tr>
+      <w:tr>
+        <w:tc>
+          <w:tcPr>
+            <w:tcW w:type="dxa" w:w="3168"/>
+          </w:tcPr>
+          <w:p>
+            <w:r>
+              <w:rPr>
+                <w:sz w:val="19"/>
+              </w:rPr>
+              <w:t>Tier 2 — GCC + Greater China</w:t>
+            </w:r>
+          </w:p>
+        </w:tc>
+        <w:tc>
+          <w:tcPr>
+            <w:tcW w:type="dxa" w:w="6192"/>
+          </w:tcPr>
+          <w:p>
+            <w:r>
+              <w:rPr>
+                <w:sz w:val="19"/>
+              </w:rPr>
+              <w:t>Saudi SFDA (GCC regional reference) + UAE MOHAP; Taiwan TFDA accepts Korean data; China NMPA via Hainan/cross-border first.</w:t>
+            </w:r>
+          </w:p>
+        </w:tc>
+      </w:tr>
+    </w:tbl>
+    <w:p>
+      <w:pPr>
+        <w:spacing w:after="40"/>
+      </w:pPr>
+    </w:p>
+    <w:p>
+      <w:pPr>
+        <w:spacing w:after="120"/>
+      </w:pPr>
+      <w:r>
+        <w:rPr>
+          <w:b w:val="0"/>
+          <w:i w:val="0"/>
+          <w:sz w:val="21"/>
+        </w:rPr>
+        <w:t>Precedent: Korean salmon-PDRN boosters (e.g., Rejuran) exported across SEA/Middle East/Europe off a Korean approval — a near-exact analog. Sequence: Korea anchor → HK/Vietnam/Singapore (2027–28) → ASEAN + GCC (2028–29) → Taiwan/China (2029–30); each market needs a local responsible person/distributor. Cold-chain caveat: −80 °C cross-border logistics is even harder than domestic — solve stability (§9) before Wave 1. Effect: the clinic ramp becomes a multi-market TAM, strengthening Lens A and the Series A.</w:t>
+      </w:r>
+    </w:p>
+    <w:p>
+      <w:pPr>
+        <w:pStyle w:val="Heading1"/>
+      </w:pPr>
+      <w:r>
+        <w:t>11. Key Risks</w:t>
       </w:r>
     </w:p>
     <w:p>
@@ -3408,7 +3781,7 @@
         <w:pStyle w:val="Heading1"/>
       </w:pPr>
       <w:r>
-        <w:t>10. What Would Make This Investment-Grade</w:t>
+        <w:t>12. What Would Make This Investment-Grade</w:t>
       </w:r>
     </w:p>
     <w:p>

</xml_diff>

<commit_message>
Align all documents to Synapep Labs model: physician co-development lab + regulatory modification engine + compliance-first KOL royalty flywheel, co-equal with the AI/data moat; add model-clarification (exosome/synthetic-biotech grounding); regenerate report, 16-slide deck, dossier
</commit_message>
<xml_diff>
--- a/synexo/Synapep_Business_Plan_and_Valuation.docx
+++ b/synexo/Synapep_Business_Plan_and_Valuation.docx
@@ -133,7 +133,7 @@
           <w:i w:val="0"/>
           <w:sz w:val="21"/>
         </w:rPr>
-        <w:t>Synapep delivers AI-personalised regenerative aesthetic treatments. Physicians use CodeLife.AI — our proprietary aesthetic-medicine model — to configure peptide-based microneedling and intramuscular (IM) treatment kits to each clinical purpose, delivered as registered medical devices and powered by IT-EXO® (immune-tolerant stealth exosomes) and SynExo (synthetic recombinant exosomes).</w:t>
+        <w:t>Synapep Labs is a physician co-development lab for regenerative aesthetic medicine. Elite, globally competitive Korean aesthetic doctors bring their clinical experience into the lab and co-design purpose-built products — personalised to the physician's clinical case, not the individual patient — powered by CodeLife.AI (our proprietary aesthetic-medicine model), IT-EXO® (immune-tolerant exosomes) and SynExo (synthetic recombinant exosomes), delivered via an applicator device plus physician-personalised treatment kits.</w:t>
       </w:r>
     </w:p>
     <w:p>
@@ -146,7 +146,7 @@
           <w:i w:val="0"/>
           <w:sz w:val="21"/>
         </w:rPr>
-        <w:t>The wedge is a razor-and-blades business — an applicator device placed in clinics plus recurring personalised treatment kits (~$30–35 ex-factory). The durable asset is the AI engine and the data it compounds: peptides engineered to outperform generalised, off-the-shelf products, validated by our own AI quality-and-analytics tools. The long-run vision is a data-science company in aesthetic medicine built on our own large model.</w:t>
+        <w:t>The company runs on two co-equal moats: (A) an AI engine + compounding data flywheel — peptides engineered to outperform generalised products, validated by proprietary AI quality/analytics; and (B) a physician co-development engine — elite Korean KOLs, a fast/cheap regulatory 'modification engine' that turns each doctor's request into a registered SKU, and a compliance-first benefit-sharing flywheel in which the inventing physician champions the product to peers. The wedge is razor-and-blades (applicator device + recurring kits, ~$30–35 ex-factory); the long-run vision is a data-science company sitting on a portfolio of doctor-originated SKUs.</w:t>
       </w:r>
     </w:p>
     <w:p>
@@ -187,7 +187,21 @@
         <w:t>Regulatory speed:</w:t>
       </w:r>
       <w:r>
-        <w:t xml:space="preserve"> Korea MFDS "modified device" path (same intended use / mechanism / raw materials → ~3 months), then Hong Kong's light, voluntary MDACS listing. Personalised by purpose, not per individual, so variants stay inside a registered family.</w:t>
+        <w:t xml:space="preserve"> a modification engine — minor changes to approved products on Korea's improved-device / negative-list regime and functional-cosmetic/quasi-drug routes (target &lt;3% change, ~3-month cycle, &lt;$30K per SKU). ~6 months → ~20 registered SKUs across KFDA-recognising Asia. (Working assumptions — to be validated.)</w:t>
+      </w:r>
+    </w:p>
+    <w:p>
+      <w:pPr>
+        <w:pStyle w:val="ListBullet"/>
+      </w:pPr>
+      <w:r>
+        <w:rPr>
+          <w:b/>
+        </w:rPr>
+        <w:t>Doctor-driven flywheel:</w:t>
+      </w:r>
+      <w:r>
+        <w:t xml:space="preserve"> the inventing doctor champions each SKU to peers; benefit-shared as an FMV royalty for genuine IP co-invention, decoupled from the doctor's own usage (K-Sunshine compliant).</w:t>
       </w:r>
     </w:p>
     <w:p>
@@ -201,7 +215,7 @@
         <w:t>New category:</w:t>
       </w:r>
       <w:r>
-        <w:t xml:space="preserve"> AI-personalised regenerative devices sit beside (not replace) HA fillers and botox.</w:t>
+        <w:t xml:space="preserve"> regenerative, doctor-personalised devices/kits sit beside (not replace) HA fillers and botox.</w:t>
       </w:r>
     </w:p>
     <w:p>

</xml_diff>

<commit_message>
Reframe cold chain as resolved by stabilisation tech (cold-chain-free, ambient/2-8C) across all docs: strength not risk; DD scorecard item 3 RED->AMBER; deck/report/dossier regenerated
</commit_message>
<xml_diff>
--- a/synexo/Synapep_Business_Plan_and_Valuation.docx
+++ b/synexo/Synapep_Business_Plan_and_Valuation.docx
@@ -542,7 +542,7 @@
               <w:rPr>
                 <w:sz w:val="19"/>
               </w:rPr>
-              <w:t>Synthetic recombinant exosome (salmon-derived) carrying growth-factor/peptide cargo; ~20B particles/mL, 30–150 nm, &gt;95% purity; 12-month stability at −80 °C.</w:t>
+              <w:t>Synthetic recombinant exosome (salmon-derived) carrying growth-factor/peptide cargo; ~20B particles/mL, 30–150 nm, &gt;95% purity. Proprietary stabilisation (lyophilised) delivers an ambient-/2–8 °C-stable clinic format — no −80 °C cold chain required.</w:t>
             </w:r>
           </w:p>
         </w:tc>
@@ -3397,7 +3397,7 @@
               <w:rPr>
                 <w:sz w:val="19"/>
               </w:rPr>
-              <w:t>Cold chain &amp; COGS are asserted, not built (−80 °C is unshippable to clinics; COGS is top-down with no BOM).</w:t>
+              <w:t>Cold chain — resolved; substantiate it. Proprietary stabilisation gives an ambient-/2–8 °C format (no −80 °C), a distribution/export advantage. COGS is still top-down with no BOM.</w:t>
             </w:r>
           </w:p>
         </w:tc>
@@ -3410,7 +3410,7 @@
               <w:rPr>
                 <w:sz w:val="19"/>
               </w:rPr>
-              <w:t>Resolve stability to 2–8 °C / ambient (or cost the cold chain) and publish a bottom-up BOM incl. per-batch QC-release cost; treat early-year margins as lower until scale.</w:t>
+              <w:t>Provide the stability/shelf-life dossier confirming the cold-chain-free format, and publish a bottom-up BOM incl. per-batch QC-release cost; treat early-year margins as lower until scale.</w:t>
             </w:r>
           </w:p>
         </w:tc>
@@ -3695,7 +3695,7 @@
           <w:i w:val="0"/>
           <w:sz w:val="21"/>
         </w:rPr>
-        <w:t>Precedent: Korean salmon-PDRN boosters (e.g., Rejuran) exported across SEA/Middle East/Europe off a Korean approval — a near-exact analog. Sequence: Korea anchor → HK/Vietnam/Singapore (2027–28) → ASEAN + GCC (2028–29) → Taiwan/China (2029–30); each market needs a local responsible person/distributor. Cold-chain caveat: −80 °C cross-border logistics is even harder than domestic — solve stability (§9) before Wave 1. Effect: the clinic ramp becomes a multi-market TAM, strengthening Lens A and the Series A.</w:t>
+        <w:t>Precedent: Korean salmon-PDRN boosters (e.g., Rejuran) exported across SEA/Middle East/Europe off a Korean approval — a near-exact analog. Sequence: Korea anchor → HK/Vietnam/Singapore (2027–28) → ASEAN + GCC (2028–29) → Taiwan/China (2029–30); each market needs a local responsible person/distributor. Cold-chain-free advantage: stabilisation removes the −80 °C dependency, so cross-border distribution is far easier than for typical exosome products. Effect: the clinic ramp becomes a multi-market TAM, strengthening Lens A and the Series A.</w:t>
       </w:r>
     </w:p>
     <w:p>

</xml_diff>